<commit_message>
docs: MN1 preparing the report piece by piece
</commit_message>
<xml_diff>
--- a/51MN Metologija naukovyh doslidjen/1/MN1_KNT-116m_Onyshchenko_15.docx
+++ b/51MN Metologija naukovyh doslidjen/1/MN1_KNT-116m_Onyshchenko_15.docx
@@ -260,7 +260,23 @@
       </w:pPr>
       <w:r>
         <w:rPr/>
-        <w:t xml:space="preserve">Студент КНТ-122 </w:t>
+        <w:t>Студент КНТ-</w:t>
+      </w:r>
+      <w:r>
+        <w:rPr>
+          <w:lang w:val="en-US"/>
+        </w:rPr>
+        <w:t>1</w:t>
+      </w:r>
+      <w:r>
+        <w:rPr>
+          <w:lang w:val="uk-UA"/>
+        </w:rPr>
+        <w:t>16м</w:t>
+      </w:r>
+      <w:r>
+        <w:rPr/>
+        <w:t xml:space="preserve"> </w:t>
         <w:tab/>
         <w:tab/>
         <w:tab/>
@@ -893,6 +909,131 @@
     </w:p>
     <w:p>
       <w:pPr>
+        <w:pStyle w:val="p11"/>
+        <w:rPr/>
+      </w:pPr>
+      <w:r>
+        <w:rPr/>
+      </w:r>
+    </w:p>
+    <w:p>
+      <w:pPr>
+        <w:pStyle w:val="p11"/>
+        <w:rPr/>
+      </w:pPr>
+      <w:r>
+        <w:rPr/>
+        <w:t>Темою є прогнозування погоди на основі даних з сенсорів метеостанції села Комишуваха.</w:t>
+      </w:r>
+    </w:p>
+    <w:p>
+      <w:pPr>
+        <w:pStyle w:val="p11"/>
+        <w:rPr/>
+      </w:pPr>
+      <w:r>
+        <w:rPr/>
+        <w:t>Початковими джерелами є:</w:t>
+      </w:r>
+    </w:p>
+    <w:p>
+      <w:pPr>
+        <w:pStyle w:val="p11"/>
+        <w:widowControl/>
+        <w:numPr>
+          <w:ilvl w:val="0"/>
+          <w:numId w:val="1"/>
+        </w:numPr>
+        <w:suppressAutoHyphens w:val="true"/>
+        <w:bidi w:val="0"/>
+        <w:spacing w:lineRule="auto" w:line="360" w:before="0" w:after="0"/>
+        <w:ind w:firstLine="850" w:left="0" w:right="0"/>
+        <w:rPr/>
+      </w:pPr>
+      <w:hyperlink r:id="rId2">
+        <w:r>
+          <w:rPr>
+            <w:rStyle w:val="Hyperlink"/>
+          </w:rPr>
+          <w:t>Machine Learning Applied to Weather Forecasting</w:t>
+        </w:r>
+      </w:hyperlink>
+      <w:r>
+        <w:rPr/>
+        <w:t>;</w:t>
+      </w:r>
+    </w:p>
+    <w:p>
+      <w:pPr>
+        <w:pStyle w:val="p11"/>
+        <w:widowControl/>
+        <w:numPr>
+          <w:ilvl w:val="0"/>
+          <w:numId w:val="1"/>
+        </w:numPr>
+        <w:suppressAutoHyphens w:val="true"/>
+        <w:bidi w:val="0"/>
+        <w:spacing w:lineRule="auto" w:line="360" w:before="0" w:after="0"/>
+        <w:ind w:firstLine="850" w:left="0" w:right="0"/>
+        <w:rPr/>
+      </w:pPr>
+      <w:hyperlink r:id="rId3">
+        <w:r>
+          <w:rPr>
+            <w:rStyle w:val="Hyperlink"/>
+          </w:rPr>
+          <w:t>Weather Forecasting Model using Artificial Neural Network</w:t>
+        </w:r>
+      </w:hyperlink>
+      <w:r>
+        <w:rPr/>
+        <w:t>;</w:t>
+      </w:r>
+    </w:p>
+    <w:p>
+      <w:pPr>
+        <w:pStyle w:val="p11"/>
+        <w:widowControl/>
+        <w:numPr>
+          <w:ilvl w:val="0"/>
+          <w:numId w:val="1"/>
+        </w:numPr>
+        <w:suppressAutoHyphens w:val="true"/>
+        <w:bidi w:val="0"/>
+        <w:spacing w:lineRule="auto" w:line="360" w:before="0" w:after="0"/>
+        <w:ind w:firstLine="850" w:left="0" w:right="0"/>
+        <w:jc w:val="both"/>
+        <w:rPr>
+          <w:lang w:val="en-US"/>
+        </w:rPr>
+      </w:pPr>
+      <w:hyperlink r:id="rId4">
+        <w:r>
+          <w:rPr>
+            <w:rStyle w:val="Hyperlink"/>
+            <w:lang w:val="en-US"/>
+          </w:rPr>
+          <w:t>A microcontroller-based data-acquisition system for meteorological station monitoring</w:t>
+        </w:r>
+      </w:hyperlink>
+      <w:r>
+        <w:rPr>
+          <w:lang w:val="en-US"/>
+        </w:rPr>
+        <w:t>.</w:t>
+      </w:r>
+    </w:p>
+    <w:p>
+      <w:pPr>
+        <w:pStyle w:val="p11"/>
+        <w:rPr/>
+      </w:pPr>
+      <w:r>
+        <w:rPr/>
+      </w:r>
+    </w:p>
+    <w:p>
+      <w:pPr>
         <w:pStyle w:val="H2"/>
         <w:rPr/>
       </w:pPr>
@@ -917,7 +1058,75 @@
       </w:pPr>
       <w:r>
         <w:rPr/>
-        <w:t xml:space="preserve">Проблемною ситуацією є те, що при вимірюванні </w:t>
+        <w:t>Процесом є збір інформації з датчиків температури, атмосферного тиску та вологості повітря на локальній метеостанції села Комишуваха.</w:t>
+      </w:r>
+    </w:p>
+    <w:p>
+      <w:pPr>
+        <w:pStyle w:val="P1"/>
+        <w:rPr/>
+      </w:pPr>
+      <w:r>
+        <w:rPr/>
+        <w:t>Учасниками процесу є працівник метеорологічної станції, який обслуговує її та підтримує її працездатність, а також мешканці села, що споживають інформацію, надану від метеостанції.</w:t>
+      </w:r>
+    </w:p>
+    <w:p>
+      <w:pPr>
+        <w:pStyle w:val="P1"/>
+        <w:rPr/>
+      </w:pPr>
+      <w:r>
+        <w:rPr/>
+        <w:t xml:space="preserve">Типовими умовами є </w:t>
+      </w:r>
+    </w:p>
+    <w:p>
+      <w:pPr>
+        <w:pStyle w:val="P1"/>
+        <w:rPr/>
+      </w:pPr>
+      <w:r>
+        <w:rPr/>
+        <w:t xml:space="preserve">Конкретним обмеженням є </w:t>
+      </w:r>
+    </w:p>
+    <w:p>
+      <w:pPr>
+        <w:pStyle w:val="P1"/>
+        <w:rPr/>
+      </w:pPr>
+      <w:r>
+        <w:rPr/>
+      </w:r>
+    </w:p>
+    <w:p>
+      <w:pPr>
+        <w:pStyle w:val="P1"/>
+        <w:rPr/>
+      </w:pPr>
+      <w:r>
+        <w:rPr/>
+        <w:t>Актуальністю є потреба мешканців села Комишуваха у вчасному та точному сповіщенні про екстремальні погодні умови а також у прогнозі погоди хоча б на наступні 24 години для планування їхнього дня.</w:t>
+      </w:r>
+    </w:p>
+    <w:p>
+      <w:pPr>
+        <w:pStyle w:val="P1"/>
+        <w:rPr/>
+      </w:pPr>
+      <w:r>
+        <w:rPr/>
+      </w:r>
+    </w:p>
+    <w:p>
+      <w:pPr>
+        <w:pStyle w:val="H2"/>
+        <w:rPr/>
+      </w:pPr>
+      <w:r>
+        <w:rPr/>
+        <w:t>Питання й методологічний апарат</w:t>
       </w:r>
     </w:p>
     <w:p>
@@ -1026,20 +1235,14 @@
     <w:p>
       <w:pPr>
         <w:pStyle w:val="P1"/>
-        <w:rPr/>
-      </w:pPr>
-      <w:r>
-        <w:rPr/>
-      </w:r>
-    </w:p>
-    <w:p>
-      <w:pPr>
-        <w:pStyle w:val="H2"/>
-        <w:rPr/>
-      </w:pPr>
-      <w:r>
-        <w:rPr/>
-        <w:t>Питання й методологічний апарат</w:t>
+        <w:rPr>
+          <w:lang w:val="uk-UA"/>
+        </w:rPr>
+      </w:pPr>
+      <w:r>
+        <w:rPr>
+          <w:lang w:val="uk-UA"/>
+        </w:rPr>
       </w:r>
     </w:p>
     <w:p>
@@ -1083,6 +1286,255 @@
     </w:sectPr>
   </w:body>
 </w:document>
+</file>
+
+<file path=word/numbering.xml><?xml version="1.0" encoding="utf-8"?>
+<w:numbering xmlns:w="http://schemas.openxmlformats.org/wordprocessingml/2006/main" xmlns:o="urn:schemas-microsoft-com:office:office" xmlns:r="http://schemas.openxmlformats.org/officeDocument/2006/relationships" xmlns:v="urn:schemas-microsoft-com:vml" xmlns:mc="http://schemas.openxmlformats.org/markup-compatibility/2006" xmlns:w14="http://schemas.microsoft.com/office/word/2010/wordml" mc:Ignorable="w14">
+  <w:abstractNum w:abstractNumId="1">
+    <w:lvl w:ilvl="0">
+      <w:start w:val="1"/>
+      <w:numFmt w:val="decimal"/>
+      <w:lvlText w:val="%1."/>
+      <w:lvlJc w:val="left"/>
+      <w:pPr>
+        <w:tabs>
+          <w:tab w:val="num" w:pos="720"/>
+        </w:tabs>
+        <w:ind w:left="720" w:hanging="360"/>
+      </w:pPr>
+      <w:rPr/>
+    </w:lvl>
+    <w:lvl w:ilvl="1">
+      <w:start w:val="1"/>
+      <w:numFmt w:val="decimal"/>
+      <w:lvlText w:val="%2."/>
+      <w:lvlJc w:val="left"/>
+      <w:pPr>
+        <w:tabs>
+          <w:tab w:val="num" w:pos="1080"/>
+        </w:tabs>
+        <w:ind w:left="1080" w:hanging="360"/>
+      </w:pPr>
+      <w:rPr/>
+    </w:lvl>
+    <w:lvl w:ilvl="2">
+      <w:start w:val="1"/>
+      <w:numFmt w:val="decimal"/>
+      <w:lvlText w:val="%3."/>
+      <w:lvlJc w:val="left"/>
+      <w:pPr>
+        <w:tabs>
+          <w:tab w:val="num" w:pos="1440"/>
+        </w:tabs>
+        <w:ind w:left="1440" w:hanging="360"/>
+      </w:pPr>
+      <w:rPr/>
+    </w:lvl>
+    <w:lvl w:ilvl="3">
+      <w:start w:val="1"/>
+      <w:numFmt w:val="decimal"/>
+      <w:lvlText w:val="%4."/>
+      <w:lvlJc w:val="left"/>
+      <w:pPr>
+        <w:tabs>
+          <w:tab w:val="num" w:pos="1800"/>
+        </w:tabs>
+        <w:ind w:left="1800" w:hanging="360"/>
+      </w:pPr>
+      <w:rPr/>
+    </w:lvl>
+    <w:lvl w:ilvl="4">
+      <w:start w:val="1"/>
+      <w:numFmt w:val="decimal"/>
+      <w:lvlText w:val="%5."/>
+      <w:lvlJc w:val="left"/>
+      <w:pPr>
+        <w:tabs>
+          <w:tab w:val="num" w:pos="2160"/>
+        </w:tabs>
+        <w:ind w:left="2160" w:hanging="360"/>
+      </w:pPr>
+      <w:rPr/>
+    </w:lvl>
+    <w:lvl w:ilvl="5">
+      <w:start w:val="1"/>
+      <w:numFmt w:val="decimal"/>
+      <w:lvlText w:val="%6."/>
+      <w:lvlJc w:val="left"/>
+      <w:pPr>
+        <w:tabs>
+          <w:tab w:val="num" w:pos="2520"/>
+        </w:tabs>
+        <w:ind w:left="2520" w:hanging="360"/>
+      </w:pPr>
+      <w:rPr/>
+    </w:lvl>
+    <w:lvl w:ilvl="6">
+      <w:start w:val="1"/>
+      <w:numFmt w:val="decimal"/>
+      <w:lvlText w:val="%7."/>
+      <w:lvlJc w:val="left"/>
+      <w:pPr>
+        <w:tabs>
+          <w:tab w:val="num" w:pos="2880"/>
+        </w:tabs>
+        <w:ind w:left="2880" w:hanging="360"/>
+      </w:pPr>
+      <w:rPr/>
+    </w:lvl>
+    <w:lvl w:ilvl="7">
+      <w:start w:val="1"/>
+      <w:numFmt w:val="decimal"/>
+      <w:lvlText w:val="%8."/>
+      <w:lvlJc w:val="left"/>
+      <w:pPr>
+        <w:tabs>
+          <w:tab w:val="num" w:pos="3240"/>
+        </w:tabs>
+        <w:ind w:left="3240" w:hanging="360"/>
+      </w:pPr>
+      <w:rPr/>
+    </w:lvl>
+    <w:lvl w:ilvl="8">
+      <w:start w:val="1"/>
+      <w:numFmt w:val="decimal"/>
+      <w:lvlText w:val="%9."/>
+      <w:lvlJc w:val="left"/>
+      <w:pPr>
+        <w:tabs>
+          <w:tab w:val="num" w:pos="3600"/>
+        </w:tabs>
+        <w:ind w:left="3600" w:hanging="360"/>
+      </w:pPr>
+      <w:rPr/>
+    </w:lvl>
+  </w:abstractNum>
+  <w:abstractNum w:abstractNumId="2">
+    <w:lvl w:ilvl="0">
+      <w:start w:val="1"/>
+      <w:numFmt w:val="none"/>
+      <w:suff w:val="nothing"/>
+      <w:lvlText w:val=""/>
+      <w:lvlJc w:val="left"/>
+      <w:pPr>
+        <w:tabs>
+          <w:tab w:val="num" w:pos="0"/>
+        </w:tabs>
+        <w:ind w:left="0" w:hanging="0"/>
+      </w:pPr>
+    </w:lvl>
+    <w:lvl w:ilvl="1">
+      <w:start w:val="1"/>
+      <w:numFmt w:val="none"/>
+      <w:suff w:val="nothing"/>
+      <w:lvlText w:val=""/>
+      <w:lvlJc w:val="left"/>
+      <w:pPr>
+        <w:tabs>
+          <w:tab w:val="num" w:pos="0"/>
+        </w:tabs>
+        <w:ind w:left="0" w:hanging="0"/>
+      </w:pPr>
+    </w:lvl>
+    <w:lvl w:ilvl="2">
+      <w:start w:val="1"/>
+      <w:numFmt w:val="none"/>
+      <w:suff w:val="nothing"/>
+      <w:lvlText w:val=""/>
+      <w:lvlJc w:val="left"/>
+      <w:pPr>
+        <w:tabs>
+          <w:tab w:val="num" w:pos="0"/>
+        </w:tabs>
+        <w:ind w:left="0" w:hanging="0"/>
+      </w:pPr>
+    </w:lvl>
+    <w:lvl w:ilvl="3">
+      <w:start w:val="1"/>
+      <w:numFmt w:val="none"/>
+      <w:suff w:val="nothing"/>
+      <w:lvlText w:val=""/>
+      <w:lvlJc w:val="left"/>
+      <w:pPr>
+        <w:tabs>
+          <w:tab w:val="num" w:pos="0"/>
+        </w:tabs>
+        <w:ind w:left="0" w:hanging="0"/>
+      </w:pPr>
+    </w:lvl>
+    <w:lvl w:ilvl="4">
+      <w:start w:val="1"/>
+      <w:numFmt w:val="none"/>
+      <w:suff w:val="nothing"/>
+      <w:lvlText w:val=""/>
+      <w:lvlJc w:val="left"/>
+      <w:pPr>
+        <w:tabs>
+          <w:tab w:val="num" w:pos="0"/>
+        </w:tabs>
+        <w:ind w:left="0" w:hanging="0"/>
+      </w:pPr>
+    </w:lvl>
+    <w:lvl w:ilvl="5">
+      <w:start w:val="1"/>
+      <w:numFmt w:val="none"/>
+      <w:suff w:val="nothing"/>
+      <w:lvlText w:val=""/>
+      <w:lvlJc w:val="left"/>
+      <w:pPr>
+        <w:tabs>
+          <w:tab w:val="num" w:pos="0"/>
+        </w:tabs>
+        <w:ind w:left="0" w:hanging="0"/>
+      </w:pPr>
+    </w:lvl>
+    <w:lvl w:ilvl="6">
+      <w:start w:val="1"/>
+      <w:numFmt w:val="none"/>
+      <w:suff w:val="nothing"/>
+      <w:lvlText w:val=""/>
+      <w:lvlJc w:val="left"/>
+      <w:pPr>
+        <w:tabs>
+          <w:tab w:val="num" w:pos="0"/>
+        </w:tabs>
+        <w:ind w:left="0" w:hanging="0"/>
+      </w:pPr>
+    </w:lvl>
+    <w:lvl w:ilvl="7">
+      <w:start w:val="1"/>
+      <w:numFmt w:val="none"/>
+      <w:suff w:val="nothing"/>
+      <w:lvlText w:val=""/>
+      <w:lvlJc w:val="left"/>
+      <w:pPr>
+        <w:tabs>
+          <w:tab w:val="num" w:pos="0"/>
+        </w:tabs>
+        <w:ind w:left="0" w:hanging="0"/>
+      </w:pPr>
+    </w:lvl>
+    <w:lvl w:ilvl="8">
+      <w:start w:val="1"/>
+      <w:numFmt w:val="none"/>
+      <w:suff w:val="nothing"/>
+      <w:lvlText w:val=""/>
+      <w:lvlJc w:val="left"/>
+      <w:pPr>
+        <w:tabs>
+          <w:tab w:val="num" w:pos="0"/>
+        </w:tabs>
+        <w:ind w:left="0" w:hanging="0"/>
+      </w:pPr>
+    </w:lvl>
+  </w:abstractNum>
+  <w:num w:numId="1">
+    <w:abstractNumId w:val="1"/>
+  </w:num>
+  <w:num w:numId="2">
+    <w:abstractNumId w:val="2"/>
+  </w:num>
+</w:numbering>
 </file>
 
 <file path=word/styles.xml><?xml version="1.0" encoding="utf-8"?>
@@ -1870,8 +2322,8 @@
       <w:lang w:val="en-US" w:eastAsia="uk-UA"/>
     </w:rPr>
   </w:style>
-  <w:style w:type="character" w:styleId="Style12">
-    <w:name w:val="Символ нумерації"/>
+  <w:style w:type="character" w:styleId="user">
+    <w:name w:val="Символ нумерації (user)"/>
     <w:qFormat/>
     <w:rPr/>
   </w:style>
@@ -1883,14 +2335,26 @@
       <w:bCs/>
     </w:rPr>
   </w:style>
-  <w:style w:type="character" w:styleId="user">
-    <w:name w:val="Маркери (user)"/>
+  <w:style w:type="character" w:styleId="Style12">
+    <w:name w:val="Маркери"/>
     <w:qFormat/>
     <w:rPr>
       <w:rFonts w:ascii="OpenSymbol" w:hAnsi="OpenSymbol" w:eastAsia="OpenSymbol" w:cs="OpenSymbol"/>
     </w:rPr>
   </w:style>
-  <w:style w:type="paragraph" w:styleId="Style13">
+  <w:style w:type="character" w:styleId="Style13">
+    <w:name w:val="Символ нумерації"/>
+    <w:qFormat/>
+    <w:rPr/>
+  </w:style>
+  <w:style w:type="character" w:styleId="FollowedHyperlink">
+    <w:name w:val="FollowedHyperlink"/>
+    <w:rPr>
+      <w:color w:val="800000"/>
+      <w:u w:val="single"/>
+    </w:rPr>
+  </w:style>
+  <w:style w:type="paragraph" w:styleId="Style14">
     <w:name w:val="Заголовок"/>
     <w:basedOn w:val="Normal"/>
     <w:next w:val="BodyText"/>
@@ -1900,7 +2364,7 @@
       <w:spacing w:before="240" w:after="120"/>
     </w:pPr>
     <w:rPr>
-      <w:rFonts w:ascii="Liberation Sans" w:hAnsi="Liberation Sans" w:eastAsia="Microsoft YaHei" w:cs="Lucida Sans"/>
+      <w:rFonts w:ascii="Liberation Sans" w:hAnsi="Liberation Sans" w:eastAsia="Microsoft YaHei" w:cs="Arial Unicode MS"/>
       <w:sz w:val="28"/>
       <w:szCs w:val="28"/>
     </w:rPr>
@@ -1937,7 +2401,7 @@
       <w:szCs w:val="24"/>
     </w:rPr>
   </w:style>
-  <w:style w:type="paragraph" w:styleId="Style14">
+  <w:style w:type="paragraph" w:styleId="Style15">
     <w:name w:val="Покажчик"/>
     <w:basedOn w:val="Normal"/>
     <w:qFormat/>
@@ -1945,7 +2409,7 @@
       <w:suppressLineNumbers/>
     </w:pPr>
     <w:rPr>
-      <w:rFonts w:cs="Lucida Sans"/>
+      <w:rFonts w:cs="Arial Unicode MS"/>
     </w:rPr>
   </w:style>
   <w:style w:type="paragraph" w:styleId="user1">
@@ -1958,7 +2422,7 @@
       <w:spacing w:before="240" w:after="120"/>
     </w:pPr>
     <w:rPr>
-      <w:rFonts w:ascii="Liberation Sans" w:hAnsi="Liberation Sans" w:eastAsia="Microsoft YaHei" w:cs="Arial Unicode MS"/>
+      <w:rFonts w:ascii="Liberation Sans" w:hAnsi="Liberation Sans" w:eastAsia="Microsoft YaHei" w:cs="Lucida Sans"/>
       <w:sz w:val="28"/>
       <w:szCs w:val="28"/>
     </w:rPr>
@@ -1971,12 +2435,12 @@
       <w:suppressLineNumbers/>
     </w:pPr>
     <w:rPr>
-      <w:rFonts w:cs="Arial Unicode MS"/>
+      <w:rFonts w:cs="Lucida Sans"/>
     </w:rPr>
   </w:style>
   <w:style w:type="paragraph" w:styleId="IndexHeading">
     <w:name w:val="index heading"/>
-    <w:basedOn w:val="user1"/>
+    <w:basedOn w:val="Style14"/>
     <w:pPr/>
     <w:rPr/>
   </w:style>
@@ -2252,8 +2716,8 @@
     </w:pPr>
     <w:rPr/>
   </w:style>
-  <w:style w:type="paragraph" w:styleId="Style15">
-    <w:name w:val="Верхній і нижній колонтитули"/>
+  <w:style w:type="paragraph" w:styleId="user3">
+    <w:name w:val="Верхній і нижній колонтитули (user)"/>
     <w:basedOn w:val="Normal"/>
     <w:qFormat/>
     <w:pPr>
@@ -2266,8 +2730,8 @@
     </w:pPr>
     <w:rPr/>
   </w:style>
-  <w:style w:type="paragraph" w:styleId="user3">
-    <w:name w:val="Верхній і нижній колонтитули (user)"/>
+  <w:style w:type="paragraph" w:styleId="Style16">
+    <w:name w:val="Верхній і нижній колонтитули"/>
     <w:basedOn w:val="Normal"/>
     <w:qFormat/>
     <w:pPr/>
@@ -2275,14 +2739,14 @@
   </w:style>
   <w:style w:type="paragraph" w:styleId="Header">
     <w:name w:val="header"/>
-    <w:basedOn w:val="Style15"/>
+    <w:basedOn w:val="user3"/>
     <w:pPr>
       <w:suppressLineNumbers/>
     </w:pPr>
     <w:rPr/>
   </w:style>
-  <w:style w:type="numbering" w:styleId="user4" w:default="1">
-    <w:name w:val="Без маркерів (user)"/>
+  <w:style w:type="numbering" w:styleId="Style17" w:default="1">
+    <w:name w:val="Без маркерів"/>
     <w:uiPriority w:val="99"/>
     <w:semiHidden/>
     <w:unhideWhenUsed/>

</xml_diff>

<commit_message>
feat: MN1 first chapter done i hope
</commit_message>
<xml_diff>
--- a/51MN Metologija naukovyh doslidjen/1/MN1_KNT-116m_Onyshchenko_15.docx
+++ b/51MN Metologija naukovyh doslidjen/1/MN1_KNT-116m_Onyshchenko_15.docx
@@ -1038,6 +1038,12 @@
         <w:rPr/>
       </w:pPr>
       <w:r>
+        <w:rPr>
+          <w:lang w:val="en-US"/>
+        </w:rPr>
+        <w:t xml:space="preserve">1 </w:t>
+      </w:r>
+      <w:r>
         <w:rPr/>
         <w:t>Проблемна ситуація, джерела та актуальність</w:t>
       </w:r>
@@ -1080,6 +1086,10 @@
         <w:rPr/>
         <w:t xml:space="preserve">Типовими умовами є </w:t>
       </w:r>
+      <w:r>
+        <w:rPr/>
+        <w:t>змінна погода та такі датчики, що з плином часу втрачають свою точність через використання.</w:t>
+      </w:r>
     </w:p>
     <w:p>
       <w:pPr>
@@ -1090,6 +1100,10 @@
         <w:rPr/>
         <w:t xml:space="preserve">Конкретним обмеженням є </w:t>
       </w:r>
+      <w:r>
+        <w:rPr/>
+        <w:t>така точність датчиків, що постійно зменшується.</w:t>
+      </w:r>
     </w:p>
     <w:p>
       <w:pPr>
@@ -1098,6 +1112,7 @@
       </w:pPr>
       <w:r>
         <w:rPr/>
+        <w:t>Першим наслідком обмеження є можливий неточний прогноз погоди.</w:t>
       </w:r>
     </w:p>
     <w:p>
@@ -1107,6 +1122,16 @@
       </w:pPr>
       <w:r>
         <w:rPr/>
+        <w:t>Другим наслідком обмеження є необхідність лагодити та/або замінювати датчики на нові з часом.</w:t>
+      </w:r>
+    </w:p>
+    <w:p>
+      <w:pPr>
+        <w:pStyle w:val="P1"/>
+        <w:rPr/>
+      </w:pPr>
+      <w:r>
+        <w:rPr/>
         <w:t>Актуальністю є потреба мешканців села Комишуваха у вчасному та точному сповіщенні про екстремальні погодні умови а також у прогнозі погоди хоча б на наступні 24 години для планування їхнього дня.</w:t>
       </w:r>
     </w:p>
@@ -1125,8 +1150,32 @@
         <w:rPr/>
       </w:pPr>
       <w:r>
+        <w:rPr>
+          <w:lang w:val="en-US"/>
+        </w:rPr>
+        <w:t xml:space="preserve">2 </w:t>
+      </w:r>
+      <w:r>
         <w:rPr/>
         <w:t>Питання й методологічний апарат</w:t>
+      </w:r>
+    </w:p>
+    <w:p>
+      <w:pPr>
+        <w:pStyle w:val="P1"/>
+        <w:rPr/>
+      </w:pPr>
+      <w:r>
+        <w:rPr/>
+      </w:r>
+    </w:p>
+    <w:p>
+      <w:pPr>
+        <w:pStyle w:val="P1"/>
+        <w:rPr/>
+      </w:pPr>
+      <w:r>
+        <w:rPr/>
       </w:r>
     </w:p>
     <w:p>
@@ -1251,6 +1300,12 @@
         <w:rPr/>
       </w:pPr>
       <w:r>
+        <w:rPr>
+          <w:lang w:val="en-US"/>
+        </w:rPr>
+        <w:t xml:space="preserve">3 </w:t>
+      </w:r>
+      <w:r>
         <w:rPr/>
         <w:t>Відповідність завдань результатам</w:t>
       </w:r>
@@ -1261,6 +1316,12 @@
         <w:rPr/>
       </w:pPr>
       <w:r>
+        <w:rPr>
+          <w:lang w:val="en-US"/>
+        </w:rPr>
+        <w:t xml:space="preserve">4 </w:t>
+      </w:r>
+      <w:r>
         <w:rPr/>
         <w:t>Первинна метрика, baseline, дані, ризики й резервний сценарій</w:t>
       </w:r>
@@ -1270,6 +1331,12 @@
         <w:pStyle w:val="H2"/>
         <w:rPr/>
       </w:pPr>
+      <w:r>
+        <w:rPr>
+          <w:lang w:val="en-US"/>
+        </w:rPr>
+        <w:t xml:space="preserve">5 </w:t>
+      </w:r>
       <w:r>
         <w:rPr/>
         <w:t>Короткий запис змін після взаємного обговорення</w:t>
@@ -2322,8 +2389,8 @@
       <w:lang w:val="en-US" w:eastAsia="uk-UA"/>
     </w:rPr>
   </w:style>
-  <w:style w:type="character" w:styleId="user">
-    <w:name w:val="Символ нумерації (user)"/>
+  <w:style w:type="character" w:styleId="Style12">
+    <w:name w:val="Символ нумерації"/>
     <w:qFormat/>
     <w:rPr/>
   </w:style>
@@ -2335,15 +2402,15 @@
       <w:bCs/>
     </w:rPr>
   </w:style>
-  <w:style w:type="character" w:styleId="Style12">
-    <w:name w:val="Маркери"/>
+  <w:style w:type="character" w:styleId="user">
+    <w:name w:val="Маркери (user)"/>
     <w:qFormat/>
     <w:rPr>
       <w:rFonts w:ascii="OpenSymbol" w:hAnsi="OpenSymbol" w:eastAsia="OpenSymbol" w:cs="OpenSymbol"/>
     </w:rPr>
   </w:style>
-  <w:style w:type="character" w:styleId="Style13">
-    <w:name w:val="Символ нумерації"/>
+  <w:style w:type="character" w:styleId="user1">
+    <w:name w:val="Символ нумерації (user)"/>
     <w:qFormat/>
     <w:rPr/>
   </w:style>
@@ -2354,7 +2421,7 @@
       <w:u w:val="single"/>
     </w:rPr>
   </w:style>
-  <w:style w:type="paragraph" w:styleId="Style14">
+  <w:style w:type="paragraph" w:styleId="Style13">
     <w:name w:val="Заголовок"/>
     <w:basedOn w:val="Normal"/>
     <w:next w:val="BodyText"/>
@@ -2364,7 +2431,7 @@
       <w:spacing w:before="240" w:after="120"/>
     </w:pPr>
     <w:rPr>
-      <w:rFonts w:ascii="Liberation Sans" w:hAnsi="Liberation Sans" w:eastAsia="Microsoft YaHei" w:cs="Arial Unicode MS"/>
+      <w:rFonts w:ascii="Liberation Sans" w:hAnsi="Liberation Sans" w:eastAsia="Microsoft YaHei" w:cs="Lucida Sans"/>
       <w:sz w:val="28"/>
       <w:szCs w:val="28"/>
     </w:rPr>
@@ -2401,7 +2468,7 @@
       <w:szCs w:val="24"/>
     </w:rPr>
   </w:style>
-  <w:style w:type="paragraph" w:styleId="Style15">
+  <w:style w:type="paragraph" w:styleId="Style14">
     <w:name w:val="Покажчик"/>
     <w:basedOn w:val="Normal"/>
     <w:qFormat/>
@@ -2409,10 +2476,10 @@
       <w:suppressLineNumbers/>
     </w:pPr>
     <w:rPr>
-      <w:rFonts w:cs="Arial Unicode MS"/>
-    </w:rPr>
-  </w:style>
-  <w:style w:type="paragraph" w:styleId="user1">
+      <w:rFonts w:cs="Lucida Sans"/>
+    </w:rPr>
+  </w:style>
+  <w:style w:type="paragraph" w:styleId="user2">
     <w:name w:val="Заголовок (user)"/>
     <w:basedOn w:val="Normal"/>
     <w:next w:val="BodyText"/>
@@ -2422,12 +2489,12 @@
       <w:spacing w:before="240" w:after="120"/>
     </w:pPr>
     <w:rPr>
-      <w:rFonts w:ascii="Liberation Sans" w:hAnsi="Liberation Sans" w:eastAsia="Microsoft YaHei" w:cs="Lucida Sans"/>
+      <w:rFonts w:ascii="Liberation Sans" w:hAnsi="Liberation Sans" w:eastAsia="Microsoft YaHei" w:cs="Arial Unicode MS"/>
       <w:sz w:val="28"/>
       <w:szCs w:val="28"/>
     </w:rPr>
   </w:style>
-  <w:style w:type="paragraph" w:styleId="user2">
+  <w:style w:type="paragraph" w:styleId="user3">
     <w:name w:val="Покажчик (user)"/>
     <w:basedOn w:val="Normal"/>
     <w:qFormat/>
@@ -2435,12 +2502,12 @@
       <w:suppressLineNumbers/>
     </w:pPr>
     <w:rPr>
-      <w:rFonts w:cs="Lucida Sans"/>
+      <w:rFonts w:cs="Arial Unicode MS"/>
     </w:rPr>
   </w:style>
   <w:style w:type="paragraph" w:styleId="IndexHeading">
     <w:name w:val="index heading"/>
-    <w:basedOn w:val="Style14"/>
+    <w:basedOn w:val="user2"/>
     <w:pPr/>
     <w:rPr/>
   </w:style>
@@ -2716,8 +2783,8 @@
     </w:pPr>
     <w:rPr/>
   </w:style>
-  <w:style w:type="paragraph" w:styleId="user3">
-    <w:name w:val="Верхній і нижній колонтитули (user)"/>
+  <w:style w:type="paragraph" w:styleId="Style15">
+    <w:name w:val="Верхній і нижній колонтитули"/>
     <w:basedOn w:val="Normal"/>
     <w:qFormat/>
     <w:pPr>
@@ -2730,8 +2797,8 @@
     </w:pPr>
     <w:rPr/>
   </w:style>
-  <w:style w:type="paragraph" w:styleId="Style16">
-    <w:name w:val="Верхній і нижній колонтитули"/>
+  <w:style w:type="paragraph" w:styleId="user4">
+    <w:name w:val="Верхній і нижній колонтитули (user)"/>
     <w:basedOn w:val="Normal"/>
     <w:qFormat/>
     <w:pPr/>
@@ -2739,14 +2806,14 @@
   </w:style>
   <w:style w:type="paragraph" w:styleId="Header">
     <w:name w:val="header"/>
-    <w:basedOn w:val="user3"/>
+    <w:basedOn w:val="Style15"/>
     <w:pPr>
       <w:suppressLineNumbers/>
     </w:pPr>
     <w:rPr/>
   </w:style>
-  <w:style w:type="numbering" w:styleId="Style17" w:default="1">
-    <w:name w:val="Без маркерів"/>
+  <w:style w:type="numbering" w:styleId="user5" w:default="1">
+    <w:name w:val="Без маркерів (user)"/>
     <w:uiPriority w:val="99"/>
     <w:semiHidden/>
     <w:unhideWhenUsed/>

</xml_diff>

<commit_message>
docs: MN1 got the feedback
</commit_message>
<xml_diff>
--- a/51MN Metologija naukovyh doslidjen/1/MN1_KNT-116m_Onyshchenko_15.docx
+++ b/51MN Metologija naukovyh doslidjen/1/MN1_KNT-116m_Onyshchenko_15.docx
@@ -1084,11 +1084,7 @@
       </w:pPr>
       <w:r>
         <w:rPr/>
-        <w:t xml:space="preserve">Типовими умовами є </w:t>
-      </w:r>
-      <w:r>
-        <w:rPr/>
-        <w:t>змінна погода та такі датчики, що з плином часу втрачають свою точність через використання.</w:t>
+        <w:t>Типовими умовами є змінна погода та такі датчики, що з плином часу втрачають свою точність через використання.</w:t>
       </w:r>
     </w:p>
     <w:p>
@@ -1098,11 +1094,7 @@
       </w:pPr>
       <w:r>
         <w:rPr/>
-        <w:t xml:space="preserve">Конкретним обмеженням є </w:t>
-      </w:r>
-      <w:r>
-        <w:rPr/>
-        <w:t>така точність датчиків, що постійно зменшується.</w:t>
+        <w:t>Конкретним обмеженням є така точність датчиків, що постійно зменшується.</w:t>
       </w:r>
     </w:p>
     <w:p>
@@ -1214,7 +1206,7 @@
       </w:pPr>
       <w:r>
         <w:rPr/>
-        <w:t>Актуальність полягає в тому, що жителі села Комишуваха потребують попередження про екстримальні природні умови, а також приблизний прогноз погоди на день для планування свого дня.</w:t>
+        <w:t>Актуальність полягає в тому, що жителі села Комишуваха потребують попередження про екстремальні природні умови, а також приблизний прогноз погоди на день для планування свого дня.</w:t>
       </w:r>
     </w:p>
     <w:p>
@@ -2389,8 +2381,8 @@
       <w:lang w:val="en-US" w:eastAsia="uk-UA"/>
     </w:rPr>
   </w:style>
-  <w:style w:type="character" w:styleId="Style12">
-    <w:name w:val="Символ нумерації"/>
+  <w:style w:type="character" w:styleId="user">
+    <w:name w:val="Символ нумерації (user)"/>
     <w:qFormat/>
     <w:rPr/>
   </w:style>
@@ -2402,15 +2394,15 @@
       <w:bCs/>
     </w:rPr>
   </w:style>
-  <w:style w:type="character" w:styleId="user">
-    <w:name w:val="Маркери (user)"/>
+  <w:style w:type="character" w:styleId="Style12">
+    <w:name w:val="Маркери"/>
     <w:qFormat/>
     <w:rPr>
       <w:rFonts w:ascii="OpenSymbol" w:hAnsi="OpenSymbol" w:eastAsia="OpenSymbol" w:cs="OpenSymbol"/>
     </w:rPr>
   </w:style>
-  <w:style w:type="character" w:styleId="user1">
-    <w:name w:val="Символ нумерації (user)"/>
+  <w:style w:type="character" w:styleId="Style13">
+    <w:name w:val="Символ нумерації"/>
     <w:qFormat/>
     <w:rPr/>
   </w:style>
@@ -2421,7 +2413,7 @@
       <w:u w:val="single"/>
     </w:rPr>
   </w:style>
-  <w:style w:type="paragraph" w:styleId="Style13">
+  <w:style w:type="paragraph" w:styleId="Style14">
     <w:name w:val="Заголовок"/>
     <w:basedOn w:val="Normal"/>
     <w:next w:val="BodyText"/>
@@ -2431,7 +2423,7 @@
       <w:spacing w:before="240" w:after="120"/>
     </w:pPr>
     <w:rPr>
-      <w:rFonts w:ascii="Liberation Sans" w:hAnsi="Liberation Sans" w:eastAsia="Microsoft YaHei" w:cs="Lucida Sans"/>
+      <w:rFonts w:ascii="Liberation Sans" w:hAnsi="Liberation Sans" w:eastAsia="Microsoft YaHei" w:cs="Arial Unicode MS"/>
       <w:sz w:val="28"/>
       <w:szCs w:val="28"/>
     </w:rPr>
@@ -2468,7 +2460,7 @@
       <w:szCs w:val="24"/>
     </w:rPr>
   </w:style>
-  <w:style w:type="paragraph" w:styleId="Style14">
+  <w:style w:type="paragraph" w:styleId="Style15">
     <w:name w:val="Покажчик"/>
     <w:basedOn w:val="Normal"/>
     <w:qFormat/>
@@ -2476,10 +2468,10 @@
       <w:suppressLineNumbers/>
     </w:pPr>
     <w:rPr>
-      <w:rFonts w:cs="Lucida Sans"/>
-    </w:rPr>
-  </w:style>
-  <w:style w:type="paragraph" w:styleId="user2">
+      <w:rFonts w:cs="Arial Unicode MS"/>
+    </w:rPr>
+  </w:style>
+  <w:style w:type="paragraph" w:styleId="user1">
     <w:name w:val="Заголовок (user)"/>
     <w:basedOn w:val="Normal"/>
     <w:next w:val="BodyText"/>
@@ -2489,12 +2481,12 @@
       <w:spacing w:before="240" w:after="120"/>
     </w:pPr>
     <w:rPr>
-      <w:rFonts w:ascii="Liberation Sans" w:hAnsi="Liberation Sans" w:eastAsia="Microsoft YaHei" w:cs="Arial Unicode MS"/>
+      <w:rFonts w:ascii="Liberation Sans" w:hAnsi="Liberation Sans" w:eastAsia="Microsoft YaHei" w:cs="Lucida Sans"/>
       <w:sz w:val="28"/>
       <w:szCs w:val="28"/>
     </w:rPr>
   </w:style>
-  <w:style w:type="paragraph" w:styleId="user3">
+  <w:style w:type="paragraph" w:styleId="user2">
     <w:name w:val="Покажчик (user)"/>
     <w:basedOn w:val="Normal"/>
     <w:qFormat/>
@@ -2502,12 +2494,12 @@
       <w:suppressLineNumbers/>
     </w:pPr>
     <w:rPr>
-      <w:rFonts w:cs="Arial Unicode MS"/>
+      <w:rFonts w:cs="Lucida Sans"/>
     </w:rPr>
   </w:style>
   <w:style w:type="paragraph" w:styleId="IndexHeading">
     <w:name w:val="index heading"/>
-    <w:basedOn w:val="user2"/>
+    <w:basedOn w:val="Style14"/>
     <w:pPr/>
     <w:rPr/>
   </w:style>
@@ -2783,8 +2775,8 @@
     </w:pPr>
     <w:rPr/>
   </w:style>
-  <w:style w:type="paragraph" w:styleId="Style15">
-    <w:name w:val="Верхній і нижній колонтитули"/>
+  <w:style w:type="paragraph" w:styleId="user3">
+    <w:name w:val="Верхній і нижній колонтитули (user)"/>
     <w:basedOn w:val="Normal"/>
     <w:qFormat/>
     <w:pPr>
@@ -2797,8 +2789,8 @@
     </w:pPr>
     <w:rPr/>
   </w:style>
-  <w:style w:type="paragraph" w:styleId="user4">
-    <w:name w:val="Верхній і нижній колонтитули (user)"/>
+  <w:style w:type="paragraph" w:styleId="Style16">
+    <w:name w:val="Верхній і нижній колонтитули"/>
     <w:basedOn w:val="Normal"/>
     <w:qFormat/>
     <w:pPr/>
@@ -2806,14 +2798,14 @@
   </w:style>
   <w:style w:type="paragraph" w:styleId="Header">
     <w:name w:val="header"/>
-    <w:basedOn w:val="Style15"/>
+    <w:basedOn w:val="user3"/>
     <w:pPr>
       <w:suppressLineNumbers/>
     </w:pPr>
     <w:rPr/>
   </w:style>
-  <w:style w:type="numbering" w:styleId="user5" w:default="1">
-    <w:name w:val="Без маркерів (user)"/>
+  <w:style w:type="numbering" w:styleId="Style17" w:default="1">
+    <w:name w:val="Без маркерів"/>
     <w:uiPriority w:val="99"/>
     <w:semiHidden/>
     <w:unhideWhenUsed/>

</xml_diff>

<commit_message>
feat: MN1 first step done
</commit_message>
<xml_diff>
--- a/51MN Metologija naukovyh doslidjen/1/MN1_KNT-116m_Onyshchenko_15.docx
+++ b/51MN Metologija naukovyh doslidjen/1/MN1_KNT-116m_Onyshchenko_15.docx
@@ -914,16 +914,6 @@
       </w:pPr>
       <w:r>
         <w:rPr/>
-      </w:r>
-    </w:p>
-    <w:p>
-      <w:pPr>
-        <w:pStyle w:val="p11"/>
-        <w:rPr/>
-      </w:pPr>
-      <w:r>
-        <w:rPr/>
-        <w:t>Темою є прогнозування погоди на основі даних з сенсорів метеостанції села Комишуваха.</w:t>
       </w:r>
     </w:p>
     <w:p>
@@ -1064,7 +1054,7 @@
       </w:pPr>
       <w:r>
         <w:rPr/>
-        <w:t>Процесом є збір інформації з датчиків температури, атмосферного тиску та вологості повітря на локальній метеостанції села Комишуваха.</w:t>
+        <w:t>Процесом є збір інформації з датчиків температури, атмосферного тиску та вологості повітря на локальній метеостанції села Комишуваха та формування на їх основі двадцяти чотирьох годинного прогнозу погоди.</w:t>
       </w:r>
     </w:p>
     <w:p>
@@ -1074,7 +1064,7 @@
       </w:pPr>
       <w:r>
         <w:rPr/>
-        <w:t>Учасниками процесу є працівник метеорологічної станції, який обслуговує її та підтримує її працездатність, а також мешканці села, що споживають інформацію, надану від метеостанції.</w:t>
+        <w:t>Учасниками є працівник станції, який обслуговує обладнання та підтримує його працездатність, а також мешканці села, які споживають інформацію зі станції, а саме попередження про екстремальну погоду та прогноз на день.</w:t>
       </w:r>
     </w:p>
     <w:p>
@@ -1084,7 +1074,7 @@
       </w:pPr>
       <w:r>
         <w:rPr/>
-        <w:t>Типовими умовами є змінна погода та такі датчики, що з плином часу втрачають свою точність через використання.</w:t>
+        <w:t>Типовими умовами є змінна погода; датчики, що з часом втрачають точність через експлуатацію та вплив довкілля, а саме перепади температури, конденсат, пил чи бруд, вітер, тощо.</w:t>
       </w:r>
     </w:p>
     <w:p>
@@ -1094,7 +1084,7 @@
       </w:pPr>
       <w:r>
         <w:rPr/>
-        <w:t>Конкретним обмеженням є така точність датчиків, що постійно зменшується.</w:t>
+        <w:t>Конкретним обмеженням є те, що виміри містять шум, а точність сенсорів поступово знижується.</w:t>
       </w:r>
     </w:p>
     <w:p>
@@ -1104,27 +1094,71 @@
       </w:pPr>
       <w:r>
         <w:rPr/>
-        <w:t>Першим наслідком обмеження є можливий неточний прогноз погоди.</w:t>
+        <w:t>Наслідки наступні:</w:t>
       </w:r>
     </w:p>
     <w:p>
       <w:pPr>
         <w:pStyle w:val="P1"/>
-        <w:rPr/>
-      </w:pPr>
-      <w:r>
-        <w:rPr/>
-        <w:t>Другим наслідком обмеження є необхідність лагодити та/або замінювати датчики на нові з часом.</w:t>
+        <w:widowControl/>
+        <w:numPr>
+          <w:ilvl w:val="0"/>
+          <w:numId w:val="2"/>
+        </w:numPr>
+        <w:suppressAutoHyphens w:val="true"/>
+        <w:bidi w:val="0"/>
+        <w:spacing w:lineRule="auto" w:line="360" w:before="0" w:after="0"/>
+        <w:ind w:firstLine="850" w:left="0" w:right="0"/>
+        <w:jc w:val="both"/>
+        <w:rPr/>
+      </w:pPr>
+      <w:r>
+        <w:rPr/>
+        <w:t>можливий неточний прогноз погоди;</w:t>
       </w:r>
     </w:p>
     <w:p>
       <w:pPr>
         <w:pStyle w:val="P1"/>
-        <w:rPr/>
-      </w:pPr>
-      <w:r>
-        <w:rPr/>
-        <w:t>Актуальністю є потреба мешканців села Комишуваха у вчасному та точному сповіщенні про екстремальні погодні умови а також у прогнозі погоди хоча б на наступні 24 години для планування їхнього дня.</w:t>
+        <w:widowControl/>
+        <w:numPr>
+          <w:ilvl w:val="0"/>
+          <w:numId w:val="2"/>
+        </w:numPr>
+        <w:suppressAutoHyphens w:val="true"/>
+        <w:bidi w:val="0"/>
+        <w:spacing w:lineRule="auto" w:line="360" w:before="0" w:after="0"/>
+        <w:ind w:firstLine="850" w:left="0" w:right="0"/>
+        <w:jc w:val="both"/>
+        <w:rPr/>
+      </w:pPr>
+      <w:r>
+        <w:rPr/>
+        <w:t>необхідність частого лагодження чи заміни датчиків.</w:t>
+      </w:r>
+    </w:p>
+    <w:p>
+      <w:pPr>
+        <w:pStyle w:val="P1"/>
+        <w:rPr/>
+      </w:pPr>
+      <w:r>
+        <w:rPr/>
+        <w:t xml:space="preserve">Припущенням є те, що шум </w:t>
+      </w:r>
+      <w:r>
+        <w:rPr/>
+        <w:t>у вимірах має високочастотний характер та може бути легко відфільтрований програмними методами (наприклад, ковзним середнім) без необхідності в заміні апаратури.</w:t>
+      </w:r>
+    </w:p>
+    <w:p>
+      <w:pPr>
+        <w:pStyle w:val="P1"/>
+        <w:rPr/>
+      </w:pPr>
+      <w:r>
+        <w:rPr/>
+        <w:t>Актуальністю є потреба мешканців села у вчасному та точному оповіщенні про екстремальні погодні умови та прогнозі погоди на наступні 24 години для планування свого дня.</w:t>
       </w:r>
     </w:p>
     <w:p>
@@ -1168,6 +1202,19 @@
       </w:pPr>
       <w:r>
         <w:rPr/>
+        <w:t xml:space="preserve">Практичною потребою є точні дані </w:t>
+      </w:r>
+      <w:r>
+        <w:rPr/>
+        <w:t xml:space="preserve">з сенсорів </w:t>
+      </w:r>
+      <w:r>
+        <w:rPr/>
+        <w:t xml:space="preserve">для подальшого </w:t>
+      </w:r>
+      <w:r>
+        <w:rPr/>
+        <w:t>прогнозу погоди.</w:t>
       </w:r>
     </w:p>
     <w:p>
@@ -1177,6 +1224,11 @@
       </w:pPr>
       <w:r>
         <w:rPr/>
+        <w:t xml:space="preserve">Брак знань в цій предметній області це новий метод </w:t>
+      </w:r>
+      <w:r>
+        <w:rPr/>
+        <w:t>прогнозування погоди.</w:t>
       </w:r>
     </w:p>
     <w:p>
@@ -1186,6 +1238,37 @@
       </w:pPr>
       <w:r>
         <w:rPr/>
+        <w:t xml:space="preserve">Головним питанням є розробка нового методу прогнозу погоди на основі </w:t>
+      </w:r>
+      <w:r>
+        <w:rPr/>
+        <w:t xml:space="preserve">неточних </w:t>
+      </w:r>
+      <w:r>
+        <w:rPr/>
+        <w:t xml:space="preserve">даних з сенсорів. </w:t>
+      </w:r>
+      <w:r>
+        <w:rPr/>
+        <w:t xml:space="preserve">У цьому питанні </w:t>
+      </w:r>
+    </w:p>
+    <w:p>
+      <w:pPr>
+        <w:pStyle w:val="P1"/>
+        <w:rPr/>
+      </w:pPr>
+      <w:r>
+        <w:rPr/>
+      </w:r>
+    </w:p>
+    <w:p>
+      <w:pPr>
+        <w:pStyle w:val="P1"/>
+        <w:rPr/>
+      </w:pPr>
+      <w:r>
+        <w:rPr/>
         <w:t>Темою є вимірювання даних погоди на метеостанції села Комишуваха.</w:t>
       </w:r>
     </w:p>
@@ -1226,7 +1309,6 @@
       </w:pPr>
       <w:r>
         <w:rPr/>
-        <w:t>Метою є підвищення точності вимірів погоди на метеостанції. Критерій перевірки: ковзне середнє.</w:t>
       </w:r>
     </w:p>
     <w:p>
@@ -1236,13 +1318,6 @@
       </w:pPr>
       <w:r>
         <w:rPr/>
-        <w:t xml:space="preserve">Об’єктом є </w:t>
-      </w:r>
-      <w:r>
-        <w:rPr>
-          <w:lang w:val="uk-UA"/>
-        </w:rPr>
-        <w:t>процес розробки програмного забезпечення для формування прогнозу погоди від даних з датчиків метеостанції.</w:t>
       </w:r>
     </w:p>
     <w:p>
@@ -1256,7 +1331,7 @@
         <w:rPr>
           <w:lang w:val="uk-UA"/>
         </w:rPr>
-        <w:t>Предметом є методи та програмні засоби формування прогнозу погоди.</w:t>
+        <w:t>Завданням для роботи є розробка програмного забезпечення вимірювання датчиків з сенсорів метеостанції та формування прогнозу погоди на 24 години вперед.</w:t>
       </w:r>
     </w:p>
     <w:p>
@@ -1270,7 +1345,71 @@
         <w:rPr>
           <w:lang w:val="uk-UA"/>
         </w:rPr>
-        <w:t>Завданням для роботи є розробка програмного забезпечення вимірювання датчиків з сенсорів метеостанції та формування прогнозу погоди на 24 години вперед.</w:t>
+      </w:r>
+    </w:p>
+    <w:p>
+      <w:pPr>
+        <w:pStyle w:val="H2"/>
+        <w:rPr/>
+      </w:pPr>
+      <w:r>
+        <w:rPr>
+          <w:lang w:val="en-US"/>
+        </w:rPr>
+        <w:t xml:space="preserve">3 </w:t>
+      </w:r>
+      <w:r>
+        <w:rPr/>
+        <w:t>Відповідність завдань результатам</w:t>
+      </w:r>
+    </w:p>
+    <w:p>
+      <w:pPr>
+        <w:pStyle w:val="P1"/>
+        <w:rPr/>
+      </w:pPr>
+      <w:r>
+        <w:rPr/>
+      </w:r>
+    </w:p>
+    <w:p>
+      <w:pPr>
+        <w:pStyle w:val="p11"/>
+        <w:rPr/>
+      </w:pPr>
+      <w:r>
+        <w:rPr/>
+        <w:t>Темою є</w:t>
+      </w:r>
+      <w:r>
+        <w:rPr>
+          <w:lang w:val="uk-UA"/>
+        </w:rPr>
+        <w:t xml:space="preserve"> розробка більш точних методів </w:t>
+      </w:r>
+      <w:r>
+        <w:rPr/>
+        <w:t>прогнозування погоди на основі даних з сенсорів метеостанції села Комишуваха.</w:t>
+      </w:r>
+    </w:p>
+    <w:p>
+      <w:pPr>
+        <w:pStyle w:val="P1"/>
+        <w:rPr/>
+      </w:pPr>
+      <w:r>
+        <w:rPr/>
+        <w:t>Метою є підвищення точності вимірів погоди на метеостанції. Критерій перевірки: ковзне середнє.</w:t>
+      </w:r>
+    </w:p>
+    <w:p>
+      <w:pPr>
+        <w:pStyle w:val="P1"/>
+        <w:rPr/>
+      </w:pPr>
+      <w:r>
+        <w:rPr/>
+        <w:t>Об’єктом є підвищення точності вимірів даних з сенсорів метеостанції.</w:t>
       </w:r>
     </w:p>
     <w:p>
@@ -1284,22 +1423,16 @@
         <w:rPr>
           <w:lang w:val="uk-UA"/>
         </w:rPr>
-      </w:r>
-    </w:p>
-    <w:p>
-      <w:pPr>
-        <w:pStyle w:val="H2"/>
-        <w:rPr/>
-      </w:pPr>
-      <w:r>
-        <w:rPr>
-          <w:lang w:val="en-US"/>
-        </w:rPr>
-        <w:t xml:space="preserve">3 </w:t>
-      </w:r>
-      <w:r>
-        <w:rPr/>
-        <w:t>Відповідність завдань результатам</w:t>
+        <w:t>Предметом є методи та програмні засоби формування прогнозу погоди.</w:t>
+      </w:r>
+    </w:p>
+    <w:p>
+      <w:pPr>
+        <w:pStyle w:val="p11"/>
+        <w:rPr/>
+      </w:pPr>
+      <w:r>
+        <w:rPr/>
       </w:r>
     </w:p>
     <w:p>
@@ -1471,6 +1604,125 @@
   <w:abstractNum w:abstractNumId="2">
     <w:lvl w:ilvl="0">
       <w:start w:val="1"/>
+      <w:numFmt w:val="decimal"/>
+      <w:lvlText w:val="%1."/>
+      <w:lvlJc w:val="left"/>
+      <w:pPr>
+        <w:tabs>
+          <w:tab w:val="num" w:pos="720"/>
+        </w:tabs>
+        <w:ind w:left="720" w:hanging="360"/>
+      </w:pPr>
+      <w:rPr/>
+    </w:lvl>
+    <w:lvl w:ilvl="1">
+      <w:start w:val="1"/>
+      <w:numFmt w:val="decimal"/>
+      <w:lvlText w:val="%2."/>
+      <w:lvlJc w:val="left"/>
+      <w:pPr>
+        <w:tabs>
+          <w:tab w:val="num" w:pos="1080"/>
+        </w:tabs>
+        <w:ind w:left="1080" w:hanging="360"/>
+      </w:pPr>
+      <w:rPr/>
+    </w:lvl>
+    <w:lvl w:ilvl="2">
+      <w:start w:val="1"/>
+      <w:numFmt w:val="decimal"/>
+      <w:lvlText w:val="%3."/>
+      <w:lvlJc w:val="left"/>
+      <w:pPr>
+        <w:tabs>
+          <w:tab w:val="num" w:pos="1440"/>
+        </w:tabs>
+        <w:ind w:left="1440" w:hanging="360"/>
+      </w:pPr>
+      <w:rPr/>
+    </w:lvl>
+    <w:lvl w:ilvl="3">
+      <w:start w:val="1"/>
+      <w:numFmt w:val="decimal"/>
+      <w:lvlText w:val="%4."/>
+      <w:lvlJc w:val="left"/>
+      <w:pPr>
+        <w:tabs>
+          <w:tab w:val="num" w:pos="1800"/>
+        </w:tabs>
+        <w:ind w:left="1800" w:hanging="360"/>
+      </w:pPr>
+      <w:rPr/>
+    </w:lvl>
+    <w:lvl w:ilvl="4">
+      <w:start w:val="1"/>
+      <w:numFmt w:val="decimal"/>
+      <w:lvlText w:val="%5."/>
+      <w:lvlJc w:val="left"/>
+      <w:pPr>
+        <w:tabs>
+          <w:tab w:val="num" w:pos="2160"/>
+        </w:tabs>
+        <w:ind w:left="2160" w:hanging="360"/>
+      </w:pPr>
+      <w:rPr/>
+    </w:lvl>
+    <w:lvl w:ilvl="5">
+      <w:start w:val="1"/>
+      <w:numFmt w:val="decimal"/>
+      <w:lvlText w:val="%6."/>
+      <w:lvlJc w:val="left"/>
+      <w:pPr>
+        <w:tabs>
+          <w:tab w:val="num" w:pos="2520"/>
+        </w:tabs>
+        <w:ind w:left="2520" w:hanging="360"/>
+      </w:pPr>
+      <w:rPr/>
+    </w:lvl>
+    <w:lvl w:ilvl="6">
+      <w:start w:val="1"/>
+      <w:numFmt w:val="decimal"/>
+      <w:lvlText w:val="%7."/>
+      <w:lvlJc w:val="left"/>
+      <w:pPr>
+        <w:tabs>
+          <w:tab w:val="num" w:pos="2880"/>
+        </w:tabs>
+        <w:ind w:left="2880" w:hanging="360"/>
+      </w:pPr>
+      <w:rPr/>
+    </w:lvl>
+    <w:lvl w:ilvl="7">
+      <w:start w:val="1"/>
+      <w:numFmt w:val="decimal"/>
+      <w:lvlText w:val="%8."/>
+      <w:lvlJc w:val="left"/>
+      <w:pPr>
+        <w:tabs>
+          <w:tab w:val="num" w:pos="3240"/>
+        </w:tabs>
+        <w:ind w:left="3240" w:hanging="360"/>
+      </w:pPr>
+      <w:rPr/>
+    </w:lvl>
+    <w:lvl w:ilvl="8">
+      <w:start w:val="1"/>
+      <w:numFmt w:val="decimal"/>
+      <w:lvlText w:val="%9."/>
+      <w:lvlJc w:val="left"/>
+      <w:pPr>
+        <w:tabs>
+          <w:tab w:val="num" w:pos="3600"/>
+        </w:tabs>
+        <w:ind w:left="3600" w:hanging="360"/>
+      </w:pPr>
+      <w:rPr/>
+    </w:lvl>
+  </w:abstractNum>
+  <w:abstractNum w:abstractNumId="3">
+    <w:lvl w:ilvl="0">
+      <w:start w:val="1"/>
       <w:numFmt w:val="none"/>
       <w:suff w:val="nothing"/>
       <w:lvlText w:val=""/>
@@ -1592,6 +1844,9 @@
   </w:num>
   <w:num w:numId="2">
     <w:abstractNumId w:val="2"/>
+  </w:num>
+  <w:num w:numId="3">
+    <w:abstractNumId w:val="3"/>
   </w:num>
 </w:numbering>
 </file>

</xml_diff>

<commit_message>
feat: MN1 step 2 done i think, Jesus thank you
</commit_message>
<xml_diff>
--- a/51MN Metologija naukovyh doslidjen/1/MN1_KNT-116m_Onyshchenko_15.docx
+++ b/51MN Metologija naukovyh doslidjen/1/MN1_KNT-116m_Onyshchenko_15.docx
@@ -1202,19 +1202,7 @@
       </w:pPr>
       <w:r>
         <w:rPr/>
-        <w:t xml:space="preserve">Практичною потребою є точні дані </w:t>
-      </w:r>
-      <w:r>
-        <w:rPr/>
-        <w:t xml:space="preserve">з сенсорів </w:t>
-      </w:r>
-      <w:r>
-        <w:rPr/>
-        <w:t xml:space="preserve">для подальшого </w:t>
-      </w:r>
-      <w:r>
-        <w:rPr/>
-        <w:t>прогнозу погоди.</w:t>
+        <w:t>Практичною потребою є точні дані для подальшого прогнозу погоди для мешканців села.</w:t>
       </w:r>
     </w:p>
     <w:p>
@@ -1224,105 +1212,122 @@
       </w:pPr>
       <w:r>
         <w:rPr/>
-        <w:t xml:space="preserve">Брак знань в цій предметній області це новий метод </w:t>
-      </w:r>
-      <w:r>
-        <w:rPr/>
-        <w:t>прогнозування погоди.</w:t>
+        <w:t>Брак знань полягає в тому, що не визначено як саме (та з якими параметрами) фільтрувати зашумлені ряди вимірів аби зменшити похибку короткострокового (щодобового) прогнозу. Також відсутній обґрунтований критерій оцінки ефекту фільтрації.</w:t>
       </w:r>
     </w:p>
     <w:p>
       <w:pPr>
         <w:pStyle w:val="P1"/>
-        <w:rPr/>
-      </w:pPr>
-      <w:r>
-        <w:rPr/>
-        <w:t xml:space="preserve">Головним питанням є розробка нового методу прогнозу погоди на основі </w:t>
-      </w:r>
-      <w:r>
-        <w:rPr/>
-        <w:t xml:space="preserve">неточних </w:t>
-      </w:r>
-      <w:r>
-        <w:rPr/>
-        <w:t xml:space="preserve">даних з сенсорів. </w:t>
-      </w:r>
-      <w:r>
-        <w:rPr/>
-        <w:t xml:space="preserve">У цьому питанні </w:t>
+        <w:rPr>
+          <w:lang w:val="uk-UA"/>
+        </w:rPr>
+      </w:pPr>
+      <w:r>
+        <w:rPr>
+          <w:lang w:val="uk-UA"/>
+        </w:rPr>
+        <w:t xml:space="preserve">Головним питанням є як застосування ковзного середнього до вимірів температури, вологості та атмосферного тиску впливає на середню абсолютну похибку (англійське, </w:t>
+      </w:r>
+      <w:r>
+        <w:rPr>
+          <w:lang w:val="en-US"/>
+        </w:rPr>
+        <w:t xml:space="preserve">MAE) </w:t>
+      </w:r>
+      <w:r>
+        <w:rPr>
+          <w:lang w:val="uk-UA"/>
+        </w:rPr>
+        <w:t>24-годинного прогнозу погоди за умов зашумлених даних метеостанції села Комишуваха.</w:t>
       </w:r>
     </w:p>
     <w:p>
       <w:pPr>
         <w:pStyle w:val="P1"/>
-        <w:rPr/>
-      </w:pPr>
-      <w:r>
-        <w:rPr/>
+        <w:rPr>
+          <w:lang w:val="uk-UA"/>
+        </w:rPr>
+      </w:pPr>
+      <w:r>
+        <w:rPr>
+          <w:lang w:val="uk-UA"/>
+        </w:rPr>
+        <w:t>Підпитаннями є:</w:t>
       </w:r>
     </w:p>
     <w:p>
       <w:pPr>
         <w:pStyle w:val="P1"/>
-        <w:rPr/>
-      </w:pPr>
-      <w:r>
-        <w:rPr/>
-        <w:t>Темою є вимірювання даних погоди на метеостанції села Комишуваха.</w:t>
+        <w:widowControl/>
+        <w:numPr>
+          <w:ilvl w:val="0"/>
+          <w:numId w:val="3"/>
+        </w:numPr>
+        <w:suppressAutoHyphens w:val="true"/>
+        <w:bidi w:val="0"/>
+        <w:spacing w:lineRule="auto" w:line="360" w:before="0" w:after="0"/>
+        <w:ind w:firstLine="850" w:left="0" w:right="0"/>
+        <w:jc w:val="both"/>
+        <w:rPr>
+          <w:lang w:val="uk-UA"/>
+        </w:rPr>
+      </w:pPr>
+      <w:r>
+        <w:rPr>
+          <w:lang w:val="uk-UA"/>
+        </w:rPr>
+        <w:t xml:space="preserve">яка ширина вікна ковзного середнього мінімізує </w:t>
+      </w:r>
+      <w:r>
+        <w:rPr>
+          <w:lang w:val="en-US"/>
+        </w:rPr>
+        <w:t xml:space="preserve">MAE </w:t>
+      </w:r>
+      <w:r>
+        <w:rPr>
+          <w:lang w:val="uk-UA"/>
+        </w:rPr>
+        <w:t>прогнозу температури?</w:t>
       </w:r>
     </w:p>
     <w:p>
       <w:pPr>
         <w:pStyle w:val="P1"/>
-        <w:rPr/>
-      </w:pPr>
-      <w:r>
-        <w:rPr/>
-        <w:t>Проблемною ситуацією є присутність шуму у вимірах.</w:t>
+        <w:widowControl/>
+        <w:numPr>
+          <w:ilvl w:val="0"/>
+          <w:numId w:val="3"/>
+        </w:numPr>
+        <w:suppressAutoHyphens w:val="true"/>
+        <w:bidi w:val="0"/>
+        <w:spacing w:lineRule="auto" w:line="360" w:before="0" w:after="0"/>
+        <w:ind w:firstLine="850" w:left="0" w:right="0"/>
+        <w:jc w:val="both"/>
+        <w:rPr>
+          <w:lang w:val="uk-UA"/>
+        </w:rPr>
+      </w:pPr>
+      <w:r>
+        <w:rPr>
+          <w:lang w:val="uk-UA"/>
+        </w:rPr>
+        <w:t>як фільтрація впливає на затримку виявлення різких змін погоди?</w:t>
       </w:r>
     </w:p>
     <w:p>
       <w:pPr>
         <w:pStyle w:val="P1"/>
-        <w:rPr/>
-      </w:pPr>
-      <w:r>
-        <w:rPr/>
-        <w:t>Актуальність полягає в тому, що жителі села Комишуваха потребують попередження про екстремальні природні умови, а також приблизний прогноз погоди на день для планування свого дня.</w:t>
-      </w:r>
-    </w:p>
-    <w:p>
-      <w:pPr>
-        <w:pStyle w:val="P1"/>
-        <w:rPr/>
-      </w:pPr>
-      <w:r>
-        <w:rPr/>
-        <w:t>Питання дослідження: чи можливо мінімізувати шум у вимірах погоди.</w:t>
-      </w:r>
-    </w:p>
-    <w:p>
-      <w:pPr>
-        <w:pStyle w:val="P1"/>
-        <w:rPr/>
-      </w:pPr>
-      <w:r>
-        <w:rPr/>
-      </w:r>
-    </w:p>
-    <w:p>
-      <w:pPr>
-        <w:pStyle w:val="P1"/>
-        <w:rPr/>
-      </w:pPr>
-      <w:r>
-        <w:rPr/>
-      </w:r>
-    </w:p>
-    <w:p>
-      <w:pPr>
-        <w:pStyle w:val="P1"/>
+        <w:widowControl/>
+        <w:numPr>
+          <w:ilvl w:val="0"/>
+          <w:numId w:val="3"/>
+        </w:numPr>
+        <w:suppressAutoHyphens w:val="true"/>
+        <w:bidi w:val="0"/>
+        <w:spacing w:lineRule="auto" w:line="360" w:before="0" w:after="0"/>
+        <w:ind w:firstLine="850" w:left="0" w:right="0"/>
+        <w:jc w:val="both"/>
         <w:rPr>
           <w:lang w:val="uk-UA"/>
         </w:rPr>
@@ -1331,7 +1336,19 @@
         <w:rPr>
           <w:lang w:val="uk-UA"/>
         </w:rPr>
-        <w:t>Завданням для роботи є розробка програмного забезпечення вимірювання датчиків з сенсорів метеостанції та формування прогнозу погоди на 24 години вперед.</w:t>
+        <w:t xml:space="preserve">чи стає прогноз точнішим (зменшення </w:t>
+      </w:r>
+      <w:r>
+        <w:rPr>
+          <w:lang w:val="en-US"/>
+        </w:rPr>
+        <w:t>MAE)</w:t>
+      </w:r>
+      <w:r>
+        <w:rPr>
+          <w:lang w:val="uk-UA"/>
+        </w:rPr>
+        <w:t>, якщо використати ковзне середнє на даних?</w:t>
       </w:r>
     </w:p>
     <w:p>
@@ -1723,6 +1740,125 @@
   <w:abstractNum w:abstractNumId="3">
     <w:lvl w:ilvl="0">
       <w:start w:val="1"/>
+      <w:numFmt w:val="decimal"/>
+      <w:lvlText w:val="%1."/>
+      <w:lvlJc w:val="left"/>
+      <w:pPr>
+        <w:tabs>
+          <w:tab w:val="num" w:pos="720"/>
+        </w:tabs>
+        <w:ind w:left="720" w:hanging="360"/>
+      </w:pPr>
+      <w:rPr/>
+    </w:lvl>
+    <w:lvl w:ilvl="1">
+      <w:start w:val="1"/>
+      <w:numFmt w:val="decimal"/>
+      <w:lvlText w:val="%2."/>
+      <w:lvlJc w:val="left"/>
+      <w:pPr>
+        <w:tabs>
+          <w:tab w:val="num" w:pos="1080"/>
+        </w:tabs>
+        <w:ind w:left="1080" w:hanging="360"/>
+      </w:pPr>
+      <w:rPr/>
+    </w:lvl>
+    <w:lvl w:ilvl="2">
+      <w:start w:val="1"/>
+      <w:numFmt w:val="decimal"/>
+      <w:lvlText w:val="%3."/>
+      <w:lvlJc w:val="left"/>
+      <w:pPr>
+        <w:tabs>
+          <w:tab w:val="num" w:pos="1440"/>
+        </w:tabs>
+        <w:ind w:left="1440" w:hanging="360"/>
+      </w:pPr>
+      <w:rPr/>
+    </w:lvl>
+    <w:lvl w:ilvl="3">
+      <w:start w:val="1"/>
+      <w:numFmt w:val="decimal"/>
+      <w:lvlText w:val="%4."/>
+      <w:lvlJc w:val="left"/>
+      <w:pPr>
+        <w:tabs>
+          <w:tab w:val="num" w:pos="1800"/>
+        </w:tabs>
+        <w:ind w:left="1800" w:hanging="360"/>
+      </w:pPr>
+      <w:rPr/>
+    </w:lvl>
+    <w:lvl w:ilvl="4">
+      <w:start w:val="1"/>
+      <w:numFmt w:val="decimal"/>
+      <w:lvlText w:val="%5."/>
+      <w:lvlJc w:val="left"/>
+      <w:pPr>
+        <w:tabs>
+          <w:tab w:val="num" w:pos="2160"/>
+        </w:tabs>
+        <w:ind w:left="2160" w:hanging="360"/>
+      </w:pPr>
+      <w:rPr/>
+    </w:lvl>
+    <w:lvl w:ilvl="5">
+      <w:start w:val="1"/>
+      <w:numFmt w:val="decimal"/>
+      <w:lvlText w:val="%6."/>
+      <w:lvlJc w:val="left"/>
+      <w:pPr>
+        <w:tabs>
+          <w:tab w:val="num" w:pos="2520"/>
+        </w:tabs>
+        <w:ind w:left="2520" w:hanging="360"/>
+      </w:pPr>
+      <w:rPr/>
+    </w:lvl>
+    <w:lvl w:ilvl="6">
+      <w:start w:val="1"/>
+      <w:numFmt w:val="decimal"/>
+      <w:lvlText w:val="%7."/>
+      <w:lvlJc w:val="left"/>
+      <w:pPr>
+        <w:tabs>
+          <w:tab w:val="num" w:pos="2880"/>
+        </w:tabs>
+        <w:ind w:left="2880" w:hanging="360"/>
+      </w:pPr>
+      <w:rPr/>
+    </w:lvl>
+    <w:lvl w:ilvl="7">
+      <w:start w:val="1"/>
+      <w:numFmt w:val="decimal"/>
+      <w:lvlText w:val="%8."/>
+      <w:lvlJc w:val="left"/>
+      <w:pPr>
+        <w:tabs>
+          <w:tab w:val="num" w:pos="3240"/>
+        </w:tabs>
+        <w:ind w:left="3240" w:hanging="360"/>
+      </w:pPr>
+      <w:rPr/>
+    </w:lvl>
+    <w:lvl w:ilvl="8">
+      <w:start w:val="1"/>
+      <w:numFmt w:val="decimal"/>
+      <w:lvlText w:val="%9."/>
+      <w:lvlJc w:val="left"/>
+      <w:pPr>
+        <w:tabs>
+          <w:tab w:val="num" w:pos="3600"/>
+        </w:tabs>
+        <w:ind w:left="3600" w:hanging="360"/>
+      </w:pPr>
+      <w:rPr/>
+    </w:lvl>
+  </w:abstractNum>
+  <w:abstractNum w:abstractNumId="4">
+    <w:lvl w:ilvl="0">
+      <w:start w:val="1"/>
       <w:numFmt w:val="none"/>
       <w:suff w:val="nothing"/>
       <w:lvlText w:val=""/>
@@ -1847,6 +1983,9 @@
   </w:num>
   <w:num w:numId="3">
     <w:abstractNumId w:val="3"/>
+  </w:num>
+  <w:num w:numId="4">
+    <w:abstractNumId w:val="4"/>
   </w:num>
 </w:numbering>
 </file>

</xml_diff>

<commit_message>
feat: add the ai chat app as a K project for IP
</commit_message>
<xml_diff>
--- a/51MN Metologija naukovyh doslidjen/1/MN1_KNT-116m_Onyshchenko_15.docx
+++ b/51MN Metologija naukovyh doslidjen/1/MN1_KNT-116m_Onyshchenko_15.docx
@@ -1383,10 +1383,68 @@
     <w:p>
       <w:pPr>
         <w:pStyle w:val="P1"/>
-        <w:rPr/>
-      </w:pPr>
-      <w:r>
-        <w:rPr/>
+        <w:rPr>
+          <w:lang w:val="en-US"/>
+        </w:rPr>
+      </w:pPr>
+      <w:r>
+        <w:rPr>
+          <w:lang w:val="en-US"/>
+        </w:rPr>
+      </w:r>
+    </w:p>
+    <w:p>
+      <w:pPr>
+        <w:pStyle w:val="P1"/>
+        <w:rPr>
+          <w:lang w:val="uk-UA"/>
+        </w:rPr>
+      </w:pPr>
+      <w:r>
+        <w:rPr>
+          <w:lang w:val="uk-UA"/>
+        </w:rPr>
+        <w:t>Темою є програмні методи фільтрації шуму у вимірах метеостанції для короткострокового прогнозу погоди.</w:t>
+      </w:r>
+    </w:p>
+    <w:p>
+      <w:pPr>
+        <w:pStyle w:val="P1"/>
+        <w:rPr>
+          <w:lang w:val="uk-UA"/>
+        </w:rPr>
+      </w:pPr>
+      <w:r>
+        <w:rPr>
+          <w:lang w:val="uk-UA"/>
+        </w:rPr>
+        <w:t>Метою є підвищення точності короткострокових (24-годинного) прогнозу погоди шляхом фільтрації шуму у вхідних вимірах метеостанції.</w:t>
+      </w:r>
+    </w:p>
+    <w:p>
+      <w:pPr>
+        <w:pStyle w:val="P1"/>
+        <w:rPr>
+          <w:lang w:val="uk-UA"/>
+        </w:rPr>
+      </w:pPr>
+      <w:r>
+        <w:rPr>
+          <w:lang w:val="uk-UA"/>
+        </w:rPr>
+      </w:r>
+    </w:p>
+    <w:p>
+      <w:pPr>
+        <w:pStyle w:val="P1"/>
+        <w:rPr>
+          <w:lang w:val="uk-UA"/>
+        </w:rPr>
+      </w:pPr>
+      <w:r>
+        <w:rPr>
+          <w:lang w:val="uk-UA"/>
+        </w:rPr>
       </w:r>
     </w:p>
     <w:p>

</xml_diff>

<commit_message>
feat: MN1 step 3 done Jesus thank you
</commit_message>
<xml_diff>
--- a/51MN Metologija naukovyh doslidjen/1/MN1_KNT-116m_Onyshchenko_15.docx
+++ b/51MN Metologija naukovyh doslidjen/1/MN1_KNT-116m_Onyshchenko_15.docx
@@ -1144,11 +1144,7 @@
       </w:pPr>
       <w:r>
         <w:rPr/>
-        <w:t xml:space="preserve">Припущенням є те, що шум </w:t>
-      </w:r>
-      <w:r>
-        <w:rPr/>
-        <w:t>у вимірах має високочастотний характер та може бути легко відфільтрований програмними методами (наприклад, ковзним середнім) без необхідності в заміні апаратури.</w:t>
+        <w:t>Припущенням є те, що шум у вимірах має високочастотний характер та може бути легко відфільтрований програмними методами (наприклад, ковзним середнім) без необхідності в заміні апаратури.</w:t>
       </w:r>
     </w:p>
     <w:p>
@@ -1404,7 +1400,7 @@
         <w:rPr>
           <w:lang w:val="uk-UA"/>
         </w:rPr>
-        <w:t>Темою є програмні методи фільтрації шуму у вимірах метеостанції для короткострокового прогнозу погоди.</w:t>
+        <w:t>Темою є оптимізація короткострокового прогнозування погоди локальної метеостанції на основі програмної фільтрації вимірювальних даних.</w:t>
       </w:r>
     </w:p>
     <w:p>
@@ -1418,7 +1414,19 @@
         <w:rPr>
           <w:lang w:val="uk-UA"/>
         </w:rPr>
-        <w:t>Метою є підвищення точності короткострокових (24-годинного) прогнозу погоди шляхом фільтрації шуму у вхідних вимірах метеостанції.</w:t>
+        <w:t>Метою є зменшення середньої абсолютної похибки (</w:t>
+      </w:r>
+      <w:r>
+        <w:rPr>
+          <w:lang w:val="en-US"/>
+        </w:rPr>
+        <w:t xml:space="preserve">MAE) </w:t>
+      </w:r>
+      <w:r>
+        <w:rPr>
+          <w:lang w:val="uk-UA"/>
+        </w:rPr>
+        <w:t>24-годинного прогнозу погоди шляхом застосування алгоритму фільтрації шумів на вимірах датчиків, із визначенням оптимальної ширини вікна.</w:t>
       </w:r>
     </w:p>
     <w:p>
@@ -1432,6 +1440,7 @@
         <w:rPr>
           <w:lang w:val="uk-UA"/>
         </w:rPr>
+        <w:t>Об’єктом є процес збору та обробки метеорологічних даних у локальній програмній системі моніторингу.</w:t>
       </w:r>
     </w:p>
     <w:p>
@@ -1445,60 +1454,153 @@
         <w:rPr>
           <w:lang w:val="uk-UA"/>
         </w:rPr>
-      </w:r>
-    </w:p>
-    <w:p>
-      <w:pPr>
-        <w:pStyle w:val="p11"/>
-        <w:rPr/>
-      </w:pPr>
-      <w:r>
-        <w:rPr/>
-        <w:t>Темою є</w:t>
-      </w:r>
-      <w:r>
-        <w:rPr>
-          <w:lang w:val="uk-UA"/>
-        </w:rPr>
-        <w:t xml:space="preserve"> розробка більш точних методів </w:t>
-      </w:r>
-      <w:r>
-        <w:rPr/>
-        <w:t>прогнозування погоди на основі даних з сенсорів метеостанції села Комишуваха.</w:t>
+        <w:t>Предметом є програмні методи фільтрації (ковзне середнє) та їхній вплив на точність 24-годинного прогнозу погоди.</w:t>
       </w:r>
     </w:p>
     <w:p>
       <w:pPr>
         <w:pStyle w:val="P1"/>
-        <w:rPr/>
-      </w:pPr>
-      <w:r>
-        <w:rPr/>
-        <w:t>Метою є підвищення точності вимірів погоди на метеостанції. Критерій перевірки: ковзне середнє.</w:t>
+        <w:rPr>
+          <w:lang w:val="uk-UA"/>
+        </w:rPr>
+      </w:pPr>
+      <w:r>
+        <w:rPr>
+          <w:lang w:val="uk-UA"/>
+        </w:rPr>
+        <w:t>Завданнями є:</w:t>
       </w:r>
     </w:p>
     <w:p>
       <w:pPr>
         <w:pStyle w:val="P1"/>
-        <w:rPr/>
-      </w:pPr>
-      <w:r>
-        <w:rPr/>
-        <w:t>Об’єктом є підвищення точності вимірів даних з сенсорів метеостанції.</w:t>
+        <w:widowControl/>
+        <w:numPr>
+          <w:ilvl w:val="0"/>
+          <w:numId w:val="4"/>
+        </w:numPr>
+        <w:suppressAutoHyphens w:val="true"/>
+        <w:bidi w:val="0"/>
+        <w:spacing w:lineRule="auto" w:line="360" w:before="0" w:after="0"/>
+        <w:ind w:firstLine="850" w:left="0" w:right="0"/>
+        <w:jc w:val="both"/>
+        <w:rPr>
+          <w:lang w:val="uk-UA"/>
+        </w:rPr>
+      </w:pPr>
+      <w:r>
+        <w:rPr>
+          <w:lang w:val="uk-UA"/>
+        </w:rPr>
+        <w:t>здійснити огляд літературних джерел щодо методів збору даних та попередньої обробки шумів у метеостанції. Результатом має бути аналітична матриця порівняння методів.</w:t>
       </w:r>
     </w:p>
     <w:p>
       <w:pPr>
         <w:pStyle w:val="P1"/>
-        <w:rPr>
-          <w:lang w:val="uk-UA"/>
-        </w:rPr>
-      </w:pPr>
-      <w:r>
-        <w:rPr>
-          <w:lang w:val="uk-UA"/>
-        </w:rPr>
-        <w:t>Предметом є методи та програмні засоби формування прогнозу погоди.</w:t>
+        <w:widowControl/>
+        <w:numPr>
+          <w:ilvl w:val="0"/>
+          <w:numId w:val="4"/>
+        </w:numPr>
+        <w:suppressAutoHyphens w:val="true"/>
+        <w:bidi w:val="0"/>
+        <w:spacing w:lineRule="auto" w:line="360" w:before="0" w:after="0"/>
+        <w:ind w:firstLine="850" w:left="0" w:right="0"/>
+        <w:jc w:val="both"/>
+        <w:rPr>
+          <w:lang w:val="uk-UA"/>
+        </w:rPr>
+      </w:pPr>
+      <w:r>
+        <w:rPr>
+          <w:lang w:val="uk-UA"/>
+        </w:rPr>
+        <w:t>розробити алгоритм фільтрації на основі ковзного середнього для початку вимірювань датчиків. Результатом має бути блок-схема та опис алгоритму.</w:t>
+      </w:r>
+    </w:p>
+    <w:p>
+      <w:pPr>
+        <w:pStyle w:val="P1"/>
+        <w:widowControl/>
+        <w:numPr>
+          <w:ilvl w:val="0"/>
+          <w:numId w:val="4"/>
+        </w:numPr>
+        <w:suppressAutoHyphens w:val="true"/>
+        <w:bidi w:val="0"/>
+        <w:spacing w:lineRule="auto" w:line="360" w:before="0" w:after="0"/>
+        <w:ind w:firstLine="850" w:left="0" w:right="0"/>
+        <w:jc w:val="both"/>
+        <w:rPr>
+          <w:lang w:val="uk-UA"/>
+        </w:rPr>
+      </w:pPr>
+      <w:r>
+        <w:rPr>
+          <w:lang w:val="uk-UA"/>
+        </w:rPr>
+        <w:t>реалізувати програмний модуль фільтрації та інтегрувати його у систему збору даних. Результатом має бути програмний код модулю.</w:t>
+      </w:r>
+    </w:p>
+    <w:p>
+      <w:pPr>
+        <w:pStyle w:val="P1"/>
+        <w:widowControl/>
+        <w:numPr>
+          <w:ilvl w:val="0"/>
+          <w:numId w:val="4"/>
+        </w:numPr>
+        <w:suppressAutoHyphens w:val="true"/>
+        <w:bidi w:val="0"/>
+        <w:spacing w:lineRule="auto" w:line="360" w:before="0" w:after="0"/>
+        <w:ind w:firstLine="850" w:left="0" w:right="0"/>
+        <w:jc w:val="both"/>
+        <w:rPr>
+          <w:lang w:val="uk-UA"/>
+        </w:rPr>
+      </w:pPr>
+      <w:r>
+        <w:rPr>
+          <w:lang w:val="uk-UA"/>
+        </w:rPr>
+        <w:t>провести експеримент із різними параметрами вікна фільтрації за умов зашумлених даних. Результатом має бути масив експериментальних даних.</w:t>
+      </w:r>
+    </w:p>
+    <w:p>
+      <w:pPr>
+        <w:pStyle w:val="P1"/>
+        <w:widowControl/>
+        <w:numPr>
+          <w:ilvl w:val="0"/>
+          <w:numId w:val="4"/>
+        </w:numPr>
+        <w:suppressAutoHyphens w:val="true"/>
+        <w:bidi w:val="0"/>
+        <w:spacing w:lineRule="auto" w:line="360" w:before="0" w:after="0"/>
+        <w:ind w:firstLine="850" w:left="0" w:right="0"/>
+        <w:jc w:val="both"/>
+        <w:rPr>
+          <w:lang w:val="uk-UA"/>
+        </w:rPr>
+      </w:pPr>
+      <w:r>
+        <w:rPr>
+          <w:lang w:val="uk-UA"/>
+        </w:rPr>
+        <w:t xml:space="preserve">виконати аналіз результатів експерименту (визначення </w:t>
+      </w:r>
+      <w:r>
+        <w:rPr>
+          <w:lang w:val="en-US"/>
+        </w:rPr>
+        <w:t xml:space="preserve">MAE </w:t>
+      </w:r>
+      <w:r>
+        <w:rPr>
+          <w:lang w:val="uk-UA"/>
+        </w:rPr>
+        <w:t>та затримки реагування) і сформувати висновки. Результатом має бути аналітичний звіт та висновки.</w:t>
       </w:r>
     </w:p>
     <w:p>
@@ -1917,6 +2019,125 @@
   <w:abstractNum w:abstractNumId="4">
     <w:lvl w:ilvl="0">
       <w:start w:val="1"/>
+      <w:numFmt w:val="decimal"/>
+      <w:lvlText w:val="%1."/>
+      <w:lvlJc w:val="left"/>
+      <w:pPr>
+        <w:tabs>
+          <w:tab w:val="num" w:pos="720"/>
+        </w:tabs>
+        <w:ind w:left="720" w:hanging="360"/>
+      </w:pPr>
+      <w:rPr/>
+    </w:lvl>
+    <w:lvl w:ilvl="1">
+      <w:start w:val="1"/>
+      <w:numFmt w:val="decimal"/>
+      <w:lvlText w:val="%2."/>
+      <w:lvlJc w:val="left"/>
+      <w:pPr>
+        <w:tabs>
+          <w:tab w:val="num" w:pos="1080"/>
+        </w:tabs>
+        <w:ind w:left="1080" w:hanging="360"/>
+      </w:pPr>
+      <w:rPr/>
+    </w:lvl>
+    <w:lvl w:ilvl="2">
+      <w:start w:val="1"/>
+      <w:numFmt w:val="decimal"/>
+      <w:lvlText w:val="%3."/>
+      <w:lvlJc w:val="left"/>
+      <w:pPr>
+        <w:tabs>
+          <w:tab w:val="num" w:pos="1440"/>
+        </w:tabs>
+        <w:ind w:left="1440" w:hanging="360"/>
+      </w:pPr>
+      <w:rPr/>
+    </w:lvl>
+    <w:lvl w:ilvl="3">
+      <w:start w:val="1"/>
+      <w:numFmt w:val="decimal"/>
+      <w:lvlText w:val="%4."/>
+      <w:lvlJc w:val="left"/>
+      <w:pPr>
+        <w:tabs>
+          <w:tab w:val="num" w:pos="1800"/>
+        </w:tabs>
+        <w:ind w:left="1800" w:hanging="360"/>
+      </w:pPr>
+      <w:rPr/>
+    </w:lvl>
+    <w:lvl w:ilvl="4">
+      <w:start w:val="1"/>
+      <w:numFmt w:val="decimal"/>
+      <w:lvlText w:val="%5."/>
+      <w:lvlJc w:val="left"/>
+      <w:pPr>
+        <w:tabs>
+          <w:tab w:val="num" w:pos="2160"/>
+        </w:tabs>
+        <w:ind w:left="2160" w:hanging="360"/>
+      </w:pPr>
+      <w:rPr/>
+    </w:lvl>
+    <w:lvl w:ilvl="5">
+      <w:start w:val="1"/>
+      <w:numFmt w:val="decimal"/>
+      <w:lvlText w:val="%6."/>
+      <w:lvlJc w:val="left"/>
+      <w:pPr>
+        <w:tabs>
+          <w:tab w:val="num" w:pos="2520"/>
+        </w:tabs>
+        <w:ind w:left="2520" w:hanging="360"/>
+      </w:pPr>
+      <w:rPr/>
+    </w:lvl>
+    <w:lvl w:ilvl="6">
+      <w:start w:val="1"/>
+      <w:numFmt w:val="decimal"/>
+      <w:lvlText w:val="%7."/>
+      <w:lvlJc w:val="left"/>
+      <w:pPr>
+        <w:tabs>
+          <w:tab w:val="num" w:pos="2880"/>
+        </w:tabs>
+        <w:ind w:left="2880" w:hanging="360"/>
+      </w:pPr>
+      <w:rPr/>
+    </w:lvl>
+    <w:lvl w:ilvl="7">
+      <w:start w:val="1"/>
+      <w:numFmt w:val="decimal"/>
+      <w:lvlText w:val="%8."/>
+      <w:lvlJc w:val="left"/>
+      <w:pPr>
+        <w:tabs>
+          <w:tab w:val="num" w:pos="3240"/>
+        </w:tabs>
+        <w:ind w:left="3240" w:hanging="360"/>
+      </w:pPr>
+      <w:rPr/>
+    </w:lvl>
+    <w:lvl w:ilvl="8">
+      <w:start w:val="1"/>
+      <w:numFmt w:val="decimal"/>
+      <w:lvlText w:val="%9."/>
+      <w:lvlJc w:val="left"/>
+      <w:pPr>
+        <w:tabs>
+          <w:tab w:val="num" w:pos="3600"/>
+        </w:tabs>
+        <w:ind w:left="3600" w:hanging="360"/>
+      </w:pPr>
+      <w:rPr/>
+    </w:lvl>
+  </w:abstractNum>
+  <w:abstractNum w:abstractNumId="5">
+    <w:lvl w:ilvl="0">
+      <w:start w:val="1"/>
       <w:numFmt w:val="none"/>
       <w:suff w:val="nothing"/>
       <w:lvlText w:val=""/>
@@ -2044,6 +2265,9 @@
   </w:num>
   <w:num w:numId="4">
     <w:abstractNumId w:val="4"/>
+  </w:num>
+  <w:num w:numId="5">
+    <w:abstractNumId w:val="5"/>
   </w:num>
 </w:numbering>
 </file>
@@ -2833,8 +3057,8 @@
       <w:lang w:val="en-US" w:eastAsia="uk-UA"/>
     </w:rPr>
   </w:style>
-  <w:style w:type="character" w:styleId="user">
-    <w:name w:val="Символ нумерації (user)"/>
+  <w:style w:type="character" w:styleId="Style12">
+    <w:name w:val="Символ нумерації"/>
     <w:qFormat/>
     <w:rPr/>
   </w:style>
@@ -2846,15 +3070,15 @@
       <w:bCs/>
     </w:rPr>
   </w:style>
-  <w:style w:type="character" w:styleId="Style12">
-    <w:name w:val="Маркери"/>
+  <w:style w:type="character" w:styleId="user">
+    <w:name w:val="Маркери (user)"/>
     <w:qFormat/>
     <w:rPr>
       <w:rFonts w:ascii="OpenSymbol" w:hAnsi="OpenSymbol" w:eastAsia="OpenSymbol" w:cs="OpenSymbol"/>
     </w:rPr>
   </w:style>
-  <w:style w:type="character" w:styleId="Style13">
-    <w:name w:val="Символ нумерації"/>
+  <w:style w:type="character" w:styleId="user1">
+    <w:name w:val="Символ нумерації (user)"/>
     <w:qFormat/>
     <w:rPr/>
   </w:style>
@@ -2865,7 +3089,7 @@
       <w:u w:val="single"/>
     </w:rPr>
   </w:style>
-  <w:style w:type="paragraph" w:styleId="Style14">
+  <w:style w:type="paragraph" w:styleId="Style13">
     <w:name w:val="Заголовок"/>
     <w:basedOn w:val="Normal"/>
     <w:next w:val="BodyText"/>
@@ -2875,7 +3099,7 @@
       <w:spacing w:before="240" w:after="120"/>
     </w:pPr>
     <w:rPr>
-      <w:rFonts w:ascii="Liberation Sans" w:hAnsi="Liberation Sans" w:eastAsia="Microsoft YaHei" w:cs="Arial Unicode MS"/>
+      <w:rFonts w:ascii="Liberation Sans" w:hAnsi="Liberation Sans" w:eastAsia="Microsoft YaHei" w:cs="Lucida Sans"/>
       <w:sz w:val="28"/>
       <w:szCs w:val="28"/>
     </w:rPr>
@@ -2912,7 +3136,7 @@
       <w:szCs w:val="24"/>
     </w:rPr>
   </w:style>
-  <w:style w:type="paragraph" w:styleId="Style15">
+  <w:style w:type="paragraph" w:styleId="Style14">
     <w:name w:val="Покажчик"/>
     <w:basedOn w:val="Normal"/>
     <w:qFormat/>
@@ -2920,10 +3144,10 @@
       <w:suppressLineNumbers/>
     </w:pPr>
     <w:rPr>
-      <w:rFonts w:cs="Arial Unicode MS"/>
-    </w:rPr>
-  </w:style>
-  <w:style w:type="paragraph" w:styleId="user1">
+      <w:rFonts w:cs="Lucida Sans"/>
+    </w:rPr>
+  </w:style>
+  <w:style w:type="paragraph" w:styleId="user2">
     <w:name w:val="Заголовок (user)"/>
     <w:basedOn w:val="Normal"/>
     <w:next w:val="BodyText"/>
@@ -2933,12 +3157,12 @@
       <w:spacing w:before="240" w:after="120"/>
     </w:pPr>
     <w:rPr>
-      <w:rFonts w:ascii="Liberation Sans" w:hAnsi="Liberation Sans" w:eastAsia="Microsoft YaHei" w:cs="Lucida Sans"/>
+      <w:rFonts w:ascii="Liberation Sans" w:hAnsi="Liberation Sans" w:eastAsia="Microsoft YaHei" w:cs="Arial Unicode MS"/>
       <w:sz w:val="28"/>
       <w:szCs w:val="28"/>
     </w:rPr>
   </w:style>
-  <w:style w:type="paragraph" w:styleId="user2">
+  <w:style w:type="paragraph" w:styleId="user3">
     <w:name w:val="Покажчик (user)"/>
     <w:basedOn w:val="Normal"/>
     <w:qFormat/>
@@ -2946,12 +3170,12 @@
       <w:suppressLineNumbers/>
     </w:pPr>
     <w:rPr>
-      <w:rFonts w:cs="Lucida Sans"/>
+      <w:rFonts w:cs="Arial Unicode MS"/>
     </w:rPr>
   </w:style>
   <w:style w:type="paragraph" w:styleId="IndexHeading">
     <w:name w:val="index heading"/>
-    <w:basedOn w:val="Style14"/>
+    <w:basedOn w:val="user2"/>
     <w:pPr/>
     <w:rPr/>
   </w:style>
@@ -3227,8 +3451,8 @@
     </w:pPr>
     <w:rPr/>
   </w:style>
-  <w:style w:type="paragraph" w:styleId="user3">
-    <w:name w:val="Верхній і нижній колонтитули (user)"/>
+  <w:style w:type="paragraph" w:styleId="Style15">
+    <w:name w:val="Верхній і нижній колонтитули"/>
     <w:basedOn w:val="Normal"/>
     <w:qFormat/>
     <w:pPr>
@@ -3241,8 +3465,8 @@
     </w:pPr>
     <w:rPr/>
   </w:style>
-  <w:style w:type="paragraph" w:styleId="Style16">
-    <w:name w:val="Верхній і нижній колонтитули"/>
+  <w:style w:type="paragraph" w:styleId="user4">
+    <w:name w:val="Верхній і нижній колонтитули (user)"/>
     <w:basedOn w:val="Normal"/>
     <w:qFormat/>
     <w:pPr/>
@@ -3250,14 +3474,14 @@
   </w:style>
   <w:style w:type="paragraph" w:styleId="Header">
     <w:name w:val="header"/>
-    <w:basedOn w:val="user3"/>
+    <w:basedOn w:val="Style15"/>
     <w:pPr>
       <w:suppressLineNumbers/>
     </w:pPr>
     <w:rPr/>
   </w:style>
-  <w:style w:type="numbering" w:styleId="Style17" w:default="1">
-    <w:name w:val="Без маркерів"/>
+  <w:style w:type="numbering" w:styleId="user5" w:default="1">
+    <w:name w:val="Без маркерів (user)"/>
     <w:uiPriority w:val="99"/>
     <w:semiHidden/>
     <w:unhideWhenUsed/>

</xml_diff>

<commit_message>
feat: MN1 done with ai, Jesus thank yuo
</commit_message>
<xml_diff>
--- a/51MN Metologija naukovyh doslidjen/1/MN1_KNT-116m_Onyshchenko_15.docx
+++ b/51MN Metologija naukovyh doslidjen/1/MN1_KNT-116m_Onyshchenko_15.docx
@@ -1630,6 +1630,154 @@
     </w:p>
     <w:p>
       <w:pPr>
+        <w:pStyle w:val="P1"/>
+        <w:rPr/>
+      </w:pPr>
+      <w:r>
+        <w:rPr/>
+      </w:r>
+    </w:p>
+    <w:p>
+      <w:pPr>
+        <w:pStyle w:val="P1"/>
+        <w:rPr/>
+      </w:pPr>
+      <w:r>
+        <w:rPr/>
+        <w:t>Гіпотезою є застосування ковзного середнього з оптимально підібраною шириною вікна знижує MAE 24-годинного прогнозу без критичного збільшення затримки виявлення різких змін погоди.</w:t>
+      </w:r>
+    </w:p>
+    <w:p>
+      <w:pPr>
+        <w:pStyle w:val="P1"/>
+        <w:rPr/>
+      </w:pPr>
+      <w:r>
+        <w:rPr/>
+        <w:t>Первинною метрикою є середня абсолютна похибка (MAE) прогнозу та час затримки (latency) реакції на зміну погодних умов.</w:t>
+      </w:r>
+    </w:p>
+    <w:p>
+      <w:pPr>
+        <w:pStyle w:val="P1"/>
+        <w:rPr>
+          <w:lang w:val="en-US"/>
+        </w:rPr>
+      </w:pPr>
+      <w:r>
+        <w:rPr>
+          <w:lang w:val="en-US"/>
+        </w:rPr>
+        <w:t>Baseline-</w:t>
+      </w:r>
+      <w:r>
+        <w:rPr>
+          <w:lang w:val="uk-UA"/>
+        </w:rPr>
+        <w:t>ом є прогноз погоди, побудований на необроблених (сирих) зашумлених даних метеостанції.</w:t>
+      </w:r>
+    </w:p>
+    <w:p>
+      <w:pPr>
+        <w:pStyle w:val="P1"/>
+        <w:rPr>
+          <w:lang w:val="uk-UA"/>
+        </w:rPr>
+      </w:pPr>
+      <w:r>
+        <w:rPr>
+          <w:lang w:val="uk-UA"/>
+        </w:rPr>
+        <w:t>Доступними даними є набори даних з мікроконтролерної метеостанції села Комишуваха та відкриті синоптичні архіви для еталонної валідації.</w:t>
+      </w:r>
+    </w:p>
+    <w:p>
+      <w:pPr>
+        <w:pStyle w:val="P1"/>
+        <w:rPr>
+          <w:lang w:val="uk-UA"/>
+        </w:rPr>
+      </w:pPr>
+      <w:r>
+        <w:rPr>
+          <w:lang w:val="uk-UA"/>
+        </w:rPr>
+        <w:t>Ресурсними обмеженнями є обчислювальна потужність мікроконтролера та обмежений обсяг накопичених історичних вимірювань на місці.</w:t>
+      </w:r>
+    </w:p>
+    <w:p>
+      <w:pPr>
+        <w:pStyle w:val="P1"/>
+        <w:rPr>
+          <w:lang w:val="uk-UA"/>
+        </w:rPr>
+      </w:pPr>
+      <w:r>
+        <w:rPr>
+          <w:lang w:val="uk-UA"/>
+        </w:rPr>
+        <w:t>Ризиками є:</w:t>
+      </w:r>
+    </w:p>
+    <w:p>
+      <w:pPr>
+        <w:pStyle w:val="P1"/>
+        <w:widowControl/>
+        <w:numPr>
+          <w:ilvl w:val="0"/>
+          <w:numId w:val="5"/>
+        </w:numPr>
+        <w:suppressAutoHyphens w:val="true"/>
+        <w:bidi w:val="0"/>
+        <w:spacing w:lineRule="auto" w:line="360" w:before="0" w:after="0"/>
+        <w:ind w:firstLine="850" w:left="0" w:right="0"/>
+        <w:jc w:val="both"/>
+        <w:rPr>
+          <w:lang w:val="uk-UA"/>
+        </w:rPr>
+      </w:pPr>
+      <w:r>
+        <w:rPr>
+          <w:lang w:val="uk-UA"/>
+        </w:rPr>
+        <w:t xml:space="preserve">ковзне середнє надто сильно згладжує дані, через що пропускаються різкі штормові зміни погоди. Резервною дією є перехід на адаптивне згладжування або медіанний фільтр замість класичного ковзного середнього. </w:t>
+      </w:r>
+    </w:p>
+    <w:p>
+      <w:pPr>
+        <w:pStyle w:val="P1"/>
+        <w:widowControl/>
+        <w:numPr>
+          <w:ilvl w:val="0"/>
+          <w:numId w:val="5"/>
+        </w:numPr>
+        <w:suppressAutoHyphens w:val="true"/>
+        <w:bidi w:val="0"/>
+        <w:spacing w:lineRule="auto" w:line="360" w:before="0" w:after="0"/>
+        <w:ind w:firstLine="850" w:left="0" w:right="0"/>
+        <w:jc w:val="both"/>
+        <w:rPr>
+          <w:lang w:val="uk-UA"/>
+        </w:rPr>
+      </w:pPr>
+      <w:r>
+        <w:rPr>
+          <w:lang w:val="uk-UA"/>
+        </w:rPr>
+        <w:t>нестача тривалих реальних історичних рядів даних для повноцінної перевірки. Резервною дією є використати синтетичну генерацію зашумлених датасетів на основі еталонних метеорологічних вимірів.</w:t>
+      </w:r>
+    </w:p>
+    <w:p>
+      <w:pPr>
+        <w:pStyle w:val="P1"/>
+        <w:rPr/>
+      </w:pPr>
+      <w:r>
+        <w:rPr/>
+      </w:r>
+    </w:p>
+    <w:p>
+      <w:pPr>
         <w:pStyle w:val="H2"/>
         <w:rPr/>
       </w:pPr>
@@ -1642,6 +1790,25 @@
       <w:r>
         <w:rPr/>
         <w:t>Короткий запис змін після взаємного обговорення</w:t>
+      </w:r>
+    </w:p>
+    <w:p>
+      <w:pPr>
+        <w:pStyle w:val="P1"/>
+        <w:rPr/>
+      </w:pPr>
+      <w:r>
+        <w:rPr/>
+      </w:r>
+    </w:p>
+    <w:p>
+      <w:pPr>
+        <w:pStyle w:val="P1"/>
+        <w:rPr/>
+      </w:pPr>
+      <w:r>
+        <w:rPr/>
+        <w:t>Зіставлення: Головне питання дослідження (вплив ковзного середнього на MAE) безпосередньо покривається метою, розв'язується через завдання 2–5 та оцінюється за допомогою первинної метрики (MAE і затримка). Завдання 5 безпосередньо перевіряє досягнення мети.</w:t>
       </w:r>
     </w:p>
     <w:sectPr>
@@ -2138,6 +2305,125 @@
   <w:abstractNum w:abstractNumId="5">
     <w:lvl w:ilvl="0">
       <w:start w:val="1"/>
+      <w:numFmt w:val="decimal"/>
+      <w:lvlText w:val="%1."/>
+      <w:lvlJc w:val="left"/>
+      <w:pPr>
+        <w:tabs>
+          <w:tab w:val="num" w:pos="1641"/>
+        </w:tabs>
+        <w:ind w:left="1641" w:hanging="360"/>
+      </w:pPr>
+      <w:rPr/>
+    </w:lvl>
+    <w:lvl w:ilvl="1">
+      <w:start w:val="1"/>
+      <w:numFmt w:val="decimal"/>
+      <w:lvlText w:val="%2."/>
+      <w:lvlJc w:val="left"/>
+      <w:pPr>
+        <w:tabs>
+          <w:tab w:val="num" w:pos="2001"/>
+        </w:tabs>
+        <w:ind w:left="2001" w:hanging="360"/>
+      </w:pPr>
+      <w:rPr/>
+    </w:lvl>
+    <w:lvl w:ilvl="2">
+      <w:start w:val="1"/>
+      <w:numFmt w:val="decimal"/>
+      <w:lvlText w:val="%3."/>
+      <w:lvlJc w:val="left"/>
+      <w:pPr>
+        <w:tabs>
+          <w:tab w:val="num" w:pos="2361"/>
+        </w:tabs>
+        <w:ind w:left="2361" w:hanging="360"/>
+      </w:pPr>
+      <w:rPr/>
+    </w:lvl>
+    <w:lvl w:ilvl="3">
+      <w:start w:val="1"/>
+      <w:numFmt w:val="decimal"/>
+      <w:lvlText w:val="%4."/>
+      <w:lvlJc w:val="left"/>
+      <w:pPr>
+        <w:tabs>
+          <w:tab w:val="num" w:pos="2721"/>
+        </w:tabs>
+        <w:ind w:left="2721" w:hanging="360"/>
+      </w:pPr>
+      <w:rPr/>
+    </w:lvl>
+    <w:lvl w:ilvl="4">
+      <w:start w:val="1"/>
+      <w:numFmt w:val="decimal"/>
+      <w:lvlText w:val="%5."/>
+      <w:lvlJc w:val="left"/>
+      <w:pPr>
+        <w:tabs>
+          <w:tab w:val="num" w:pos="3081"/>
+        </w:tabs>
+        <w:ind w:left="3081" w:hanging="360"/>
+      </w:pPr>
+      <w:rPr/>
+    </w:lvl>
+    <w:lvl w:ilvl="5">
+      <w:start w:val="1"/>
+      <w:numFmt w:val="decimal"/>
+      <w:lvlText w:val="%6."/>
+      <w:lvlJc w:val="left"/>
+      <w:pPr>
+        <w:tabs>
+          <w:tab w:val="num" w:pos="3441"/>
+        </w:tabs>
+        <w:ind w:left="3441" w:hanging="360"/>
+      </w:pPr>
+      <w:rPr/>
+    </w:lvl>
+    <w:lvl w:ilvl="6">
+      <w:start w:val="1"/>
+      <w:numFmt w:val="decimal"/>
+      <w:lvlText w:val="%7."/>
+      <w:lvlJc w:val="left"/>
+      <w:pPr>
+        <w:tabs>
+          <w:tab w:val="num" w:pos="3801"/>
+        </w:tabs>
+        <w:ind w:left="3801" w:hanging="360"/>
+      </w:pPr>
+      <w:rPr/>
+    </w:lvl>
+    <w:lvl w:ilvl="7">
+      <w:start w:val="1"/>
+      <w:numFmt w:val="decimal"/>
+      <w:lvlText w:val="%8."/>
+      <w:lvlJc w:val="left"/>
+      <w:pPr>
+        <w:tabs>
+          <w:tab w:val="num" w:pos="4161"/>
+        </w:tabs>
+        <w:ind w:left="4161" w:hanging="360"/>
+      </w:pPr>
+      <w:rPr/>
+    </w:lvl>
+    <w:lvl w:ilvl="8">
+      <w:start w:val="1"/>
+      <w:numFmt w:val="decimal"/>
+      <w:lvlText w:val="%9."/>
+      <w:lvlJc w:val="left"/>
+      <w:pPr>
+        <w:tabs>
+          <w:tab w:val="num" w:pos="4521"/>
+        </w:tabs>
+        <w:ind w:left="4521" w:hanging="360"/>
+      </w:pPr>
+      <w:rPr/>
+    </w:lvl>
+  </w:abstractNum>
+  <w:abstractNum w:abstractNumId="6">
+    <w:lvl w:ilvl="0">
+      <w:start w:val="1"/>
       <w:numFmt w:val="none"/>
       <w:suff w:val="nothing"/>
       <w:lvlText w:val=""/>
@@ -2268,6 +2554,9 @@
   </w:num>
   <w:num w:numId="5">
     <w:abstractNumId w:val="5"/>
+  </w:num>
+  <w:num w:numId="6">
+    <w:abstractNumId w:val="6"/>
   </w:num>
 </w:numbering>
 </file>
@@ -3057,8 +3346,8 @@
       <w:lang w:val="en-US" w:eastAsia="uk-UA"/>
     </w:rPr>
   </w:style>
-  <w:style w:type="character" w:styleId="Style12">
-    <w:name w:val="Символ нумерації"/>
+  <w:style w:type="character" w:styleId="user">
+    <w:name w:val="Символ нумерації (user)"/>
     <w:qFormat/>
     <w:rPr/>
   </w:style>
@@ -3070,15 +3359,15 @@
       <w:bCs/>
     </w:rPr>
   </w:style>
-  <w:style w:type="character" w:styleId="user">
-    <w:name w:val="Маркери (user)"/>
+  <w:style w:type="character" w:styleId="Style12">
+    <w:name w:val="Маркери"/>
     <w:qFormat/>
     <w:rPr>
       <w:rFonts w:ascii="OpenSymbol" w:hAnsi="OpenSymbol" w:eastAsia="OpenSymbol" w:cs="OpenSymbol"/>
     </w:rPr>
   </w:style>
-  <w:style w:type="character" w:styleId="user1">
-    <w:name w:val="Символ нумерації (user)"/>
+  <w:style w:type="character" w:styleId="Style13">
+    <w:name w:val="Символ нумерації"/>
     <w:qFormat/>
     <w:rPr/>
   </w:style>
@@ -3089,7 +3378,7 @@
       <w:u w:val="single"/>
     </w:rPr>
   </w:style>
-  <w:style w:type="paragraph" w:styleId="Style13">
+  <w:style w:type="paragraph" w:styleId="Style14">
     <w:name w:val="Заголовок"/>
     <w:basedOn w:val="Normal"/>
     <w:next w:val="BodyText"/>
@@ -3099,7 +3388,7 @@
       <w:spacing w:before="240" w:after="120"/>
     </w:pPr>
     <w:rPr>
-      <w:rFonts w:ascii="Liberation Sans" w:hAnsi="Liberation Sans" w:eastAsia="Microsoft YaHei" w:cs="Lucida Sans"/>
+      <w:rFonts w:ascii="Liberation Sans" w:hAnsi="Liberation Sans" w:eastAsia="Microsoft YaHei" w:cs="Arial Unicode MS"/>
       <w:sz w:val="28"/>
       <w:szCs w:val="28"/>
     </w:rPr>
@@ -3136,7 +3425,7 @@
       <w:szCs w:val="24"/>
     </w:rPr>
   </w:style>
-  <w:style w:type="paragraph" w:styleId="Style14">
+  <w:style w:type="paragraph" w:styleId="Style15">
     <w:name w:val="Покажчик"/>
     <w:basedOn w:val="Normal"/>
     <w:qFormat/>
@@ -3144,10 +3433,10 @@
       <w:suppressLineNumbers/>
     </w:pPr>
     <w:rPr>
-      <w:rFonts w:cs="Lucida Sans"/>
-    </w:rPr>
-  </w:style>
-  <w:style w:type="paragraph" w:styleId="user2">
+      <w:rFonts w:cs="Arial Unicode MS"/>
+    </w:rPr>
+  </w:style>
+  <w:style w:type="paragraph" w:styleId="user1">
     <w:name w:val="Заголовок (user)"/>
     <w:basedOn w:val="Normal"/>
     <w:next w:val="BodyText"/>
@@ -3157,12 +3446,12 @@
       <w:spacing w:before="240" w:after="120"/>
     </w:pPr>
     <w:rPr>
-      <w:rFonts w:ascii="Liberation Sans" w:hAnsi="Liberation Sans" w:eastAsia="Microsoft YaHei" w:cs="Arial Unicode MS"/>
+      <w:rFonts w:ascii="Liberation Sans" w:hAnsi="Liberation Sans" w:eastAsia="Microsoft YaHei" w:cs="Lucida Sans"/>
       <w:sz w:val="28"/>
       <w:szCs w:val="28"/>
     </w:rPr>
   </w:style>
-  <w:style w:type="paragraph" w:styleId="user3">
+  <w:style w:type="paragraph" w:styleId="user2">
     <w:name w:val="Покажчик (user)"/>
     <w:basedOn w:val="Normal"/>
     <w:qFormat/>
@@ -3170,12 +3459,12 @@
       <w:suppressLineNumbers/>
     </w:pPr>
     <w:rPr>
-      <w:rFonts w:cs="Arial Unicode MS"/>
+      <w:rFonts w:cs="Lucida Sans"/>
     </w:rPr>
   </w:style>
   <w:style w:type="paragraph" w:styleId="IndexHeading">
     <w:name w:val="index heading"/>
-    <w:basedOn w:val="user2"/>
+    <w:basedOn w:val="Style14"/>
     <w:pPr/>
     <w:rPr/>
   </w:style>
@@ -3451,8 +3740,8 @@
     </w:pPr>
     <w:rPr/>
   </w:style>
-  <w:style w:type="paragraph" w:styleId="Style15">
-    <w:name w:val="Верхній і нижній колонтитули"/>
+  <w:style w:type="paragraph" w:styleId="user3">
+    <w:name w:val="Верхній і нижній колонтитули (user)"/>
     <w:basedOn w:val="Normal"/>
     <w:qFormat/>
     <w:pPr>
@@ -3465,8 +3754,8 @@
     </w:pPr>
     <w:rPr/>
   </w:style>
-  <w:style w:type="paragraph" w:styleId="user4">
-    <w:name w:val="Верхній і нижній колонтитули (user)"/>
+  <w:style w:type="paragraph" w:styleId="Style16">
+    <w:name w:val="Верхній і нижній колонтитули"/>
     <w:basedOn w:val="Normal"/>
     <w:qFormat/>
     <w:pPr/>
@@ -3474,14 +3763,14 @@
   </w:style>
   <w:style w:type="paragraph" w:styleId="Header">
     <w:name w:val="header"/>
-    <w:basedOn w:val="Style15"/>
+    <w:basedOn w:val="user3"/>
     <w:pPr>
       <w:suppressLineNumbers/>
     </w:pPr>
     <w:rPr/>
   </w:style>
-  <w:style w:type="numbering" w:styleId="user5" w:default="1">
-    <w:name w:val="Без маркерів (user)"/>
+  <w:style w:type="numbering" w:styleId="Style17" w:default="1">
+    <w:name w:val="Без маркерів"/>
     <w:uiPriority w:val="99"/>
     <w:semiHidden/>
     <w:unhideWhenUsed/>

</xml_diff>